<commit_message>
Remove lateral ultrasonic U-S1/U-S2 from design; align Part10 figures & drawio to full-automation scope
- Figures/drawio: Figure 1 Section A 'staff-confirmed (v1)' -> 'machine-verified'; Figure 2 'export (v1)' -> 'export' (both drawio sources + PNG renders; two identical layout copies kept in sync)
- Memo v2: drop U-S1/U-S2 row from equipment table (now 6 ultrasonic points, matching draft 10.2 'Six planned ultrasonic points (U-A, U-IN, U-B1, U-B2, U-N, U-Q)'); replace 'lateral offset' criterion with read-signal-strength consistency; add exception budget row for off-centre read failures; add note explaining why lateral sensing is not in the baseline
- Draft 10.19整合稿(2).docx Figure 1/Figure 2 images replaced in place (user's working file kept open; updated copy saved alongside)
</commit_message>
<xml_diff>
--- a/08_组员资料/组内备忘_ID-Coo单牛自动判定与例外处理技术方案_v2全自动版_20261020.docx
+++ b/08_组员资料/组内备忘_ID-Coo单牛自动判定与例外处理技术方案_v2全自动版_20261020.docx
@@ -606,7 +606,7 @@
     </w:p>
     <w:p>
       <w:pPr>
-        <w:pStyle w:val="000003"/>
+        <w:pStyle w:val="000004"/>
         <w:tabs>
           <w:tab w:val="right" w:leader="dot" w:pos="9072"/>
         </w:tabs>
@@ -647,51 +647,6 @@
       </w:r>
       <w:r>
         <w:instrText xml:space="preserve"> PAGEREF section-1 \h </w:instrText>
-      </w:r>
-      <w:r>
-        <w:fldChar w:fldCharType="separate" w:fldLock="0" w:dirty="0"/>
-      </w:r>
-      <w:r>
-        <w:t>1</w:t>
-      </w:r>
-      <w:r>
-        <w:fldChar w:fldCharType="end" w:fldLock="0" w:dirty="0"/>
-      </w:r>
-    </w:p>
-    <w:p>
-      <w:pPr>
-        <w:pStyle w:val="000003"/>
-        <w:tabs>
-          <w:tab w:val="right" w:leader="dot" w:pos="9072"/>
-        </w:tabs>
-        <w:ind w:left="0"/>
-      </w:pPr>
-      <w:r>
-        <w:fldChar w:fldCharType="begin" w:fldLock="0" w:dirty="0"/>
-      </w:r>
-      <w:r>
-        <w:instrText xml:space="preserve"> HYPERLINK \l "section-2" </w:instrText>
-      </w:r>
-      <w:r>
-        <w:fldChar w:fldCharType="separate" w:fldLock="0" w:dirty="0"/>
-      </w:r>
-      <w:r>
-        <w:rPr>
-          <w:rFonts w:hint="eastAsia"/>
-        </w:rPr>
-        <w:t>二、判定逻辑与尺寸约束</w:t>
-      </w:r>
-      <w:r>
-        <w:fldChar w:fldCharType="end" w:fldLock="0" w:dirty="0"/>
-      </w:r>
-      <w:r>
-        <w:tab/>
-      </w:r>
-      <w:r>
-        <w:fldChar w:fldCharType="begin" w:fldLock="0" w:dirty="0"/>
-      </w:r>
-      <w:r>
-        <w:instrText xml:space="preserve"> PAGEREF section-2 \h </w:instrText>
       </w:r>
       <w:r>
         <w:fldChar w:fldCharType="separate" w:fldLock="0" w:dirty="0"/>
@@ -709,6 +664,51 @@
         <w:tabs>
           <w:tab w:val="right" w:leader="dot" w:pos="9072"/>
         </w:tabs>
+        <w:ind w:left="0"/>
+      </w:pPr>
+      <w:r>
+        <w:fldChar w:fldCharType="begin" w:fldLock="0" w:dirty="0"/>
+      </w:r>
+      <w:r>
+        <w:instrText xml:space="preserve"> HYPERLINK \l "section-2" </w:instrText>
+      </w:r>
+      <w:r>
+        <w:fldChar w:fldCharType="separate" w:fldLock="0" w:dirty="0"/>
+      </w:r>
+      <w:r>
+        <w:rPr>
+          <w:rFonts w:hint="eastAsia"/>
+        </w:rPr>
+        <w:t>二、判定逻辑与尺寸约束</w:t>
+      </w:r>
+      <w:r>
+        <w:fldChar w:fldCharType="end" w:fldLock="0" w:dirty="0"/>
+      </w:r>
+      <w:r>
+        <w:tab/>
+      </w:r>
+      <w:r>
+        <w:fldChar w:fldCharType="begin" w:fldLock="0" w:dirty="0"/>
+      </w:r>
+      <w:r>
+        <w:instrText xml:space="preserve"> PAGEREF section-2 \h </w:instrText>
+      </w:r>
+      <w:r>
+        <w:fldChar w:fldCharType="separate" w:fldLock="0" w:dirty="0"/>
+      </w:r>
+      <w:r>
+        <w:t>1</w:t>
+      </w:r>
+      <w:r>
+        <w:fldChar w:fldCharType="end" w:fldLock="0" w:dirty="0"/>
+      </w:r>
+    </w:p>
+    <w:p>
+      <w:pPr>
+        <w:pStyle w:val="000005"/>
+        <w:tabs>
+          <w:tab w:val="right" w:leader="dot" w:pos="9072"/>
+        </w:tabs>
         <w:ind w:left="200"/>
       </w:pPr>
       <w:r>
@@ -737,6 +737,51 @@
       </w:r>
       <w:r>
         <w:instrText xml:space="preserve"> PAGEREF section-2-1 \h </w:instrText>
+      </w:r>
+      <w:r>
+        <w:fldChar w:fldCharType="separate" w:fldLock="0" w:dirty="0"/>
+      </w:r>
+      <w:r>
+        <w:t>1</w:t>
+      </w:r>
+      <w:r>
+        <w:fldChar w:fldCharType="end" w:fldLock="0" w:dirty="0"/>
+      </w:r>
+    </w:p>
+    <w:p>
+      <w:pPr>
+        <w:pStyle w:val="000005"/>
+        <w:tabs>
+          <w:tab w:val="right" w:leader="dot" w:pos="9072"/>
+        </w:tabs>
+        <w:ind w:left="200"/>
+      </w:pPr>
+      <w:r>
+        <w:fldChar w:fldCharType="begin" w:fldLock="0" w:dirty="0"/>
+      </w:r>
+      <w:r>
+        <w:instrText xml:space="preserve"> HYPERLINK \l "section-2-2" </w:instrText>
+      </w:r>
+      <w:r>
+        <w:fldChar w:fldCharType="separate" w:fldLock="0" w:dirty="0"/>
+      </w:r>
+      <w:r>
+        <w:rPr>
+          <w:rFonts w:hint="eastAsia"/>
+        </w:rPr>
+        <w:t>（二）尺寸约束（用最小值，不用均值）</w:t>
+      </w:r>
+      <w:r>
+        <w:fldChar w:fldCharType="end" w:fldLock="0" w:dirty="0"/>
+      </w:r>
+      <w:r>
+        <w:tab/>
+      </w:r>
+      <w:r>
+        <w:fldChar w:fldCharType="begin" w:fldLock="0" w:dirty="0"/>
+      </w:r>
+      <w:r>
+        <w:instrText xml:space="preserve"> PAGEREF section-2-2 \h </w:instrText>
       </w:r>
       <w:r>
         <w:fldChar w:fldCharType="separate" w:fldLock="0" w:dirty="0"/>
@@ -754,51 +799,6 @@
         <w:tabs>
           <w:tab w:val="right" w:leader="dot" w:pos="9072"/>
         </w:tabs>
-        <w:ind w:left="200"/>
-      </w:pPr>
-      <w:r>
-        <w:fldChar w:fldCharType="begin" w:fldLock="0" w:dirty="0"/>
-      </w:r>
-      <w:r>
-        <w:instrText xml:space="preserve"> HYPERLINK \l "section-2-2" </w:instrText>
-      </w:r>
-      <w:r>
-        <w:fldChar w:fldCharType="separate" w:fldLock="0" w:dirty="0"/>
-      </w:r>
-      <w:r>
-        <w:rPr>
-          <w:rFonts w:hint="eastAsia"/>
-        </w:rPr>
-        <w:t>（二）尺寸约束（用最小值，不用均值）</w:t>
-      </w:r>
-      <w:r>
-        <w:fldChar w:fldCharType="end" w:fldLock="0" w:dirty="0"/>
-      </w:r>
-      <w:r>
-        <w:tab/>
-      </w:r>
-      <w:r>
-        <w:fldChar w:fldCharType="begin" w:fldLock="0" w:dirty="0"/>
-      </w:r>
-      <w:r>
-        <w:instrText xml:space="preserve"> PAGEREF section-2-2 \h </w:instrText>
-      </w:r>
-      <w:r>
-        <w:fldChar w:fldCharType="separate" w:fldLock="0" w:dirty="0"/>
-      </w:r>
-      <w:r>
-        <w:t>1</w:t>
-      </w:r>
-      <w:r>
-        <w:fldChar w:fldCharType="end" w:fldLock="0" w:dirty="0"/>
-      </w:r>
-    </w:p>
-    <w:p>
-      <w:pPr>
-        <w:pStyle w:val="000003"/>
-        <w:tabs>
-          <w:tab w:val="right" w:leader="dot" w:pos="9072"/>
-        </w:tabs>
         <w:ind w:left="0"/>
       </w:pPr>
       <w:r>
@@ -827,96 +827,6 @@
       </w:r>
       <w:r>
         <w:instrText xml:space="preserve"> PAGEREF section-3 \h </w:instrText>
-      </w:r>
-      <w:r>
-        <w:fldChar w:fldCharType="separate" w:fldLock="0" w:dirty="0"/>
-      </w:r>
-      <w:r>
-        <w:t>1</w:t>
-      </w:r>
-      <w:r>
-        <w:fldChar w:fldCharType="end" w:fldLock="0" w:dirty="0"/>
-      </w:r>
-    </w:p>
-    <w:p>
-      <w:pPr>
-        <w:pStyle w:val="000003"/>
-        <w:tabs>
-          <w:tab w:val="right" w:leader="dot" w:pos="9072"/>
-        </w:tabs>
-        <w:ind w:left="0"/>
-      </w:pPr>
-      <w:r>
-        <w:fldChar w:fldCharType="begin" w:fldLock="0" w:dirty="0"/>
-      </w:r>
-      <w:r>
-        <w:instrText xml:space="preserve"> HYPERLINK \l "section-4" </w:instrText>
-      </w:r>
-      <w:r>
-        <w:fldChar w:fldCharType="separate" w:fldLock="0" w:dirty="0"/>
-      </w:r>
-      <w:r>
-        <w:rPr>
-          <w:rFonts w:hint="eastAsia"/>
-        </w:rPr>
-        <w:t>四、全自动判定流程（每头牛一次）</w:t>
-      </w:r>
-      <w:r>
-        <w:fldChar w:fldCharType="end" w:fldLock="0" w:dirty="0"/>
-      </w:r>
-      <w:r>
-        <w:tab/>
-      </w:r>
-      <w:r>
-        <w:fldChar w:fldCharType="begin" w:fldLock="0" w:dirty="0"/>
-      </w:r>
-      <w:r>
-        <w:instrText xml:space="preserve"> PAGEREF section-4 \h </w:instrText>
-      </w:r>
-      <w:r>
-        <w:fldChar w:fldCharType="separate" w:fldLock="0" w:dirty="0"/>
-      </w:r>
-      <w:r>
-        <w:t>1</w:t>
-      </w:r>
-      <w:r>
-        <w:fldChar w:fldCharType="end" w:fldLock="0" w:dirty="0"/>
-      </w:r>
-    </w:p>
-    <w:p>
-      <w:pPr>
-        <w:pStyle w:val="000003"/>
-        <w:tabs>
-          <w:tab w:val="right" w:leader="dot" w:pos="9072"/>
-        </w:tabs>
-        <w:ind w:left="0"/>
-      </w:pPr>
-      <w:r>
-        <w:fldChar w:fldCharType="begin" w:fldLock="0" w:dirty="0"/>
-      </w:r>
-      <w:r>
-        <w:instrText xml:space="preserve"> HYPERLINK \l "section-5" </w:instrText>
-      </w:r>
-      <w:r>
-        <w:fldChar w:fldCharType="separate" w:fldLock="0" w:dirty="0"/>
-      </w:r>
-      <w:r>
-        <w:rPr>
-          <w:rFonts w:hint="eastAsia"/>
-        </w:rPr>
-        <w:t>五、判定数据、阈值与例外率预算</w:t>
-      </w:r>
-      <w:r>
-        <w:fldChar w:fldCharType="end" w:fldLock="0" w:dirty="0"/>
-      </w:r>
-      <w:r>
-        <w:tab/>
-      </w:r>
-      <w:r>
-        <w:fldChar w:fldCharType="begin" w:fldLock="0" w:dirty="0"/>
-      </w:r>
-      <w:r>
-        <w:instrText xml:space="preserve"> PAGEREF section-5 \h </w:instrText>
       </w:r>
       <w:r>
         <w:fldChar w:fldCharType="separate" w:fldLock="0" w:dirty="0"/>
@@ -934,13 +844,13 @@
         <w:tabs>
           <w:tab w:val="right" w:leader="dot" w:pos="9072"/>
         </w:tabs>
-        <w:ind w:left="200"/>
+        <w:ind w:left="0"/>
       </w:pPr>
       <w:r>
         <w:fldChar w:fldCharType="begin" w:fldLock="0" w:dirty="0"/>
       </w:r>
       <w:r>
-        <w:instrText xml:space="preserve"> HYPERLINK \l "section-5-1" </w:instrText>
+        <w:instrText xml:space="preserve"> HYPERLINK \l "section-4" </w:instrText>
       </w:r>
       <w:r>
         <w:fldChar w:fldCharType="separate" w:fldLock="0" w:dirty="0"/>
@@ -949,7 +859,7 @@
         <w:rPr>
           <w:rFonts w:hint="eastAsia"/>
         </w:rPr>
-        <w:t>（一）判定特征与阈值</w:t>
+        <w:t>四、全自动判定流程（每头牛一次）</w:t>
       </w:r>
       <w:r>
         <w:fldChar w:fldCharType="end" w:fldLock="0" w:dirty="0"/>
@@ -961,7 +871,7 @@
         <w:fldChar w:fldCharType="begin" w:fldLock="0" w:dirty="0"/>
       </w:r>
       <w:r>
-        <w:instrText xml:space="preserve"> PAGEREF section-5-1 \h </w:instrText>
+        <w:instrText xml:space="preserve"> PAGEREF section-4 \h </w:instrText>
       </w:r>
       <w:r>
         <w:fldChar w:fldCharType="separate" w:fldLock="0" w:dirty="0"/>
@@ -979,13 +889,13 @@
         <w:tabs>
           <w:tab w:val="right" w:leader="dot" w:pos="9072"/>
         </w:tabs>
-        <w:ind w:left="200"/>
+        <w:ind w:left="0"/>
       </w:pPr>
       <w:r>
         <w:fldChar w:fldCharType="begin" w:fldLock="0" w:dirty="0"/>
       </w:r>
       <w:r>
-        <w:instrText xml:space="preserve"> HYPERLINK \l "section-5-2" </w:instrText>
+        <w:instrText xml:space="preserve"> HYPERLINK \l "section-5" </w:instrText>
       </w:r>
       <w:r>
         <w:fldChar w:fldCharType="separate" w:fldLock="0" w:dirty="0"/>
@@ -994,7 +904,7 @@
         <w:rPr>
           <w:rFonts w:hint="eastAsia"/>
         </w:rPr>
-        <w:t>（二）例外率预算</w:t>
+        <w:t>五、判定数据、阈值与例外率预算</w:t>
       </w:r>
       <w:r>
         <w:fldChar w:fldCharType="end" w:fldLock="0" w:dirty="0"/>
@@ -1006,7 +916,7 @@
         <w:fldChar w:fldCharType="begin" w:fldLock="0" w:dirty="0"/>
       </w:r>
       <w:r>
-        <w:instrText xml:space="preserve"> PAGEREF section-5-2 \h </w:instrText>
+        <w:instrText xml:space="preserve"> PAGEREF section-5 \h </w:instrText>
       </w:r>
       <w:r>
         <w:fldChar w:fldCharType="separate" w:fldLock="0" w:dirty="0"/>
@@ -1020,7 +930,97 @@
     </w:p>
     <w:p>
       <w:pPr>
-        <w:pStyle w:val="000003"/>
+        <w:pStyle w:val="000005"/>
+        <w:tabs>
+          <w:tab w:val="right" w:leader="dot" w:pos="9072"/>
+        </w:tabs>
+        <w:ind w:left="200"/>
+      </w:pPr>
+      <w:r>
+        <w:fldChar w:fldCharType="begin" w:fldLock="0" w:dirty="0"/>
+      </w:r>
+      <w:r>
+        <w:instrText xml:space="preserve"> HYPERLINK \l "section-5-1" </w:instrText>
+      </w:r>
+      <w:r>
+        <w:fldChar w:fldCharType="separate" w:fldLock="0" w:dirty="0"/>
+      </w:r>
+      <w:r>
+        <w:rPr>
+          <w:rFonts w:hint="eastAsia"/>
+        </w:rPr>
+        <w:t>（一）判定特征与阈值</w:t>
+      </w:r>
+      <w:r>
+        <w:fldChar w:fldCharType="end" w:fldLock="0" w:dirty="0"/>
+      </w:r>
+      <w:r>
+        <w:tab/>
+      </w:r>
+      <w:r>
+        <w:fldChar w:fldCharType="begin" w:fldLock="0" w:dirty="0"/>
+      </w:r>
+      <w:r>
+        <w:instrText xml:space="preserve"> PAGEREF section-5-1 \h </w:instrText>
+      </w:r>
+      <w:r>
+        <w:fldChar w:fldCharType="separate" w:fldLock="0" w:dirty="0"/>
+      </w:r>
+      <w:r>
+        <w:t>1</w:t>
+      </w:r>
+      <w:r>
+        <w:fldChar w:fldCharType="end" w:fldLock="0" w:dirty="0"/>
+      </w:r>
+    </w:p>
+    <w:p>
+      <w:pPr>
+        <w:pStyle w:val="000005"/>
+        <w:tabs>
+          <w:tab w:val="right" w:leader="dot" w:pos="9072"/>
+        </w:tabs>
+        <w:ind w:left="200"/>
+      </w:pPr>
+      <w:r>
+        <w:fldChar w:fldCharType="begin" w:fldLock="0" w:dirty="0"/>
+      </w:r>
+      <w:r>
+        <w:instrText xml:space="preserve"> HYPERLINK \l "section-5-2" </w:instrText>
+      </w:r>
+      <w:r>
+        <w:fldChar w:fldCharType="separate" w:fldLock="0" w:dirty="0"/>
+      </w:r>
+      <w:r>
+        <w:rPr>
+          <w:rFonts w:hint="eastAsia"/>
+        </w:rPr>
+        <w:t>（二）例外率预算</w:t>
+      </w:r>
+      <w:r>
+        <w:fldChar w:fldCharType="end" w:fldLock="0" w:dirty="0"/>
+      </w:r>
+      <w:r>
+        <w:tab/>
+      </w:r>
+      <w:r>
+        <w:fldChar w:fldCharType="begin" w:fldLock="0" w:dirty="0"/>
+      </w:r>
+      <w:r>
+        <w:instrText xml:space="preserve"> PAGEREF section-5-2 \h </w:instrText>
+      </w:r>
+      <w:r>
+        <w:fldChar w:fldCharType="separate" w:fldLock="0" w:dirty="0"/>
+      </w:r>
+      <w:r>
+        <w:t>1</w:t>
+      </w:r>
+      <w:r>
+        <w:fldChar w:fldCharType="end" w:fldLock="0" w:dirty="0"/>
+      </w:r>
+    </w:p>
+    <w:p>
+      <w:pPr>
+        <w:pStyle w:val="000004"/>
         <w:tabs>
           <w:tab w:val="right" w:leader="dot" w:pos="9072"/>
         </w:tabs>
@@ -1065,7 +1065,7 @@
     </w:p>
     <w:p>
       <w:pPr>
-        <w:pStyle w:val="000003"/>
+        <w:pStyle w:val="000004"/>
         <w:tabs>
           <w:tab w:val="right" w:leader="dot" w:pos="9072"/>
         </w:tabs>
@@ -1110,7 +1110,7 @@
     </w:p>
     <w:p>
       <w:pPr>
-        <w:pStyle w:val="000003"/>
+        <w:pStyle w:val="000004"/>
         <w:tabs>
           <w:tab w:val="right" w:leader="dot" w:pos="9072"/>
         </w:tabs>
@@ -1155,7 +1155,7 @@
     </w:p>
     <w:p>
       <w:pPr>
-        <w:pStyle w:val="000003"/>
+        <w:pStyle w:val="000004"/>
         <w:tabs>
           <w:tab w:val="right" w:leader="dot" w:pos="9072"/>
         </w:tabs>
@@ -1200,7 +1200,7 @@
     </w:p>
     <w:p>
       <w:pPr>
-        <w:pStyle w:val="000003"/>
+        <w:pStyle w:val="000004"/>
         <w:tabs>
           <w:tab w:val="right" w:leader="dot" w:pos="9072"/>
         </w:tabs>
@@ -1245,7 +1245,7 @@
     </w:p>
     <w:p>
       <w:pPr>
-        <w:pStyle w:val="000003"/>
+        <w:pStyle w:val="000004"/>
         <w:tabs>
           <w:tab w:val="right" w:leader="dot" w:pos="9072"/>
         </w:tabs>
@@ -1465,7 +1465,7 @@
     </w:tbl>
     <w:p>
       <w:pPr>
-        <w:pStyle w:val="000005"/>
+        <w:pStyle w:val="000002"/>
         <w:keepNext w:val="1"/>
         <w:keepLines w:val="1"/>
         <w:spacing w:before="528" w:beforeAutospacing="1" w:after="180" w:afterAutospacing="1" w:line="384"/>
@@ -2402,7 +2402,7 @@
     </w:tbl>
     <w:p>
       <w:pPr>
-        <w:pStyle w:val="000005"/>
+        <w:pStyle w:val="000002"/>
         <w:keepNext w:val="1"/>
         <w:keepLines w:val="1"/>
         <w:spacing w:before="528" w:beforeAutospacing="1" w:after="180" w:afterAutospacing="1" w:line="384"/>
@@ -3690,7 +3690,7 @@
     </w:tbl>
     <w:p>
       <w:pPr>
-        <w:pStyle w:val="000005"/>
+        <w:pStyle w:val="000002"/>
         <w:keepNext w:val="1"/>
         <w:keepLines w:val="1"/>
         <w:spacing w:before="528" w:beforeAutospacing="1" w:after="180" w:afterAutospacing="1" w:line="384"/>
@@ -4221,145 +4221,6 @@
             </w:pPr>
             <w:r>
               <w:rPr>
-                <w:rFonts w:hint="eastAsia" w:ascii="宋体" w:hAnsi="宋体" w:eastAsia="宋体" w:cs="宋体"/>
-                <w:color w:val="212121"/>
-                <w:sz w:val="21"/>
-              </w:rPr>
-              <w:t>U-S1／U-S2</w:t>
-            </w:r>
-          </w:p>
-        </w:tc>
-        <w:tc>
-          <w:tcPr>
-            <w:tcW w:w="2408" w:type="dxa"/>
-            <w:tcBorders>
-              <w:top w:val="single" w:color="e0e0e0" w:sz="6"/>
-              <w:left w:val="single" w:color="e0e0e0" w:sz="6"/>
-              <w:bottom w:val="single" w:color="e0e0e0" w:sz="6"/>
-              <w:right w:val="single" w:color="e0e0e0" w:sz="6"/>
-            </w:tcBorders>
-            <w:tcMar>
-              <w:top w:w="108" w:type="dxa"/>
-              <w:left w:w="168" w:type="dxa"/>
-              <w:bottom w:w="108" w:type="dxa"/>
-              <w:right w:w="168" w:type="dxa"/>
-            </w:tcMar>
-            <w:vAlign w:val="top"/>
-          </w:tcPr>
-          <w:p>
-            <w:pPr>
-              <w:jc w:val="left"/>
-              <w:rPr>
-                <w:color w:val="212121"/>
-              </w:rPr>
-            </w:pPr>
-            <w:r>
-              <w:rPr>
-                <w:rFonts w:hint="eastAsia" w:ascii="宋体" w:hAnsi="宋体" w:eastAsia="宋体" w:cs="宋体"/>
-                <w:color w:val="212121"/>
-                <w:sz w:val="21"/>
-              </w:rPr>
-              <w:t>同上（可选，成本项）</w:t>
-            </w:r>
-          </w:p>
-        </w:tc>
-        <w:tc>
-          <w:tcPr>
-            <w:tcW w:w="2159" w:type="dxa"/>
-            <w:tcBorders>
-              <w:top w:val="single" w:color="e0e0e0" w:sz="6"/>
-              <w:left w:val="single" w:color="e0e0e0" w:sz="6"/>
-              <w:bottom w:val="single" w:color="e0e0e0" w:sz="6"/>
-              <w:right w:val="single" w:color="e0e0e0" w:sz="6"/>
-            </w:tcBorders>
-            <w:tcMar>
-              <w:top w:w="108" w:type="dxa"/>
-              <w:left w:w="168" w:type="dxa"/>
-              <w:bottom w:w="108" w:type="dxa"/>
-              <w:right w:w="168" w:type="dxa"/>
-            </w:tcMar>
-            <w:vAlign w:val="top"/>
-          </w:tcPr>
-          <w:p>
-            <w:pPr>
-              <w:jc w:val="left"/>
-              <w:rPr>
-                <w:color w:val="212121"/>
-              </w:rPr>
-            </w:pPr>
-            <w:r>
-              <w:rPr>
-                <w:rFonts w:hint="eastAsia" w:ascii="宋体" w:hAnsi="宋体" w:eastAsia="宋体" w:cs="宋体"/>
-                <w:color w:val="212121"/>
-                <w:sz w:val="21"/>
-              </w:rPr>
-              <w:t>B 段两侧，离地约 0.9–1.0 m</w:t>
-            </w:r>
-          </w:p>
-        </w:tc>
-        <w:tc>
-          <w:tcPr>
-            <w:tcW w:w="2660" w:type="dxa"/>
-            <w:tcBorders>
-              <w:top w:val="single" w:color="e0e0e0" w:sz="6"/>
-              <w:left w:val="single" w:color="e0e0e0" w:sz="6"/>
-              <w:bottom w:val="single" w:color="e0e0e0" w:sz="6"/>
-              <w:right w:val="single" w:color="e0e0e0" w:sz="6"/>
-            </w:tcBorders>
-            <w:tcMar>
-              <w:top w:w="108" w:type="dxa"/>
-              <w:left w:w="168" w:type="dxa"/>
-              <w:bottom w:w="108" w:type="dxa"/>
-              <w:right w:w="168" w:type="dxa"/>
-            </w:tcMar>
-            <w:vAlign w:val="top"/>
-          </w:tcPr>
-          <w:p>
-            <w:pPr>
-              <w:jc w:val="left"/>
-              <w:rPr>
-                <w:color w:val="212121"/>
-              </w:rPr>
-            </w:pPr>
-            <w:r>
-              <w:rPr>
-                <w:rFonts w:hint="eastAsia" w:ascii="宋体" w:hAnsi="宋体" w:eastAsia="宋体" w:cs="宋体"/>
-                <w:color w:val="212121"/>
-                <w:sz w:val="21"/>
-              </w:rPr>
-              <w:t>横向位置监测，保证居中、读距一致</w:t>
-            </w:r>
-          </w:p>
-        </w:tc>
-      </w:tr>
-      <w:tr>
-        <w:trPr/>
-        <w:tc>
-          <w:tcPr>
-            <w:tcW w:w="1079" w:type="dxa"/>
-            <w:tcBorders>
-              <w:top w:val="single" w:color="e0e0e0" w:sz="6"/>
-              <w:left w:val="single" w:color="e0e0e0" w:sz="6"/>
-              <w:bottom w:val="single" w:color="e0e0e0" w:sz="6"/>
-              <w:right w:val="single" w:color="e0e0e0" w:sz="6"/>
-            </w:tcBorders>
-            <w:tcMar>
-              <w:top w:w="108" w:type="dxa"/>
-              <w:left w:w="168" w:type="dxa"/>
-              <w:bottom w:w="108" w:type="dxa"/>
-              <w:right w:w="168" w:type="dxa"/>
-            </w:tcMar>
-            <w:vAlign w:val="top"/>
-          </w:tcPr>
-          <w:p>
-            <w:pPr>
-              <w:jc w:val="left"/>
-              <w:rPr>
-                <w:color w:val="212121"/>
-              </w:rPr>
-            </w:pPr>
-            <w:r>
-              <w:rPr>
                 <w:rFonts w:ascii="宋体" w:hAnsi="宋体" w:eastAsia="宋体" w:cs="宋体"/>
                 <w:color w:val="212121"/>
                 <w:sz w:val="21"/>
@@ -5186,7 +5047,7 @@
     </w:tbl>
     <w:p>
       <w:pPr>
-        <w:pStyle w:val="000005"/>
+        <w:pStyle w:val="000002"/>
         <w:keepNext w:val="1"/>
         <w:keepLines w:val="1"/>
         <w:spacing w:before="528" w:beforeAutospacing="1" w:after="180" w:afterAutospacing="1" w:line="384"/>
@@ -5212,6 +5073,73 @@
     </w:p>
     <w:p>
       <w:pPr>
+        <w:pStyle w:val="x5b1eo"/>
+        <w:rPr>
+          <w:rFonts w:hint="eastAsia" w:ascii="宋体" w:hAnsi="宋体" w:eastAsia="宋体" w:cs="宋体"/>
+          <w:color w:val="212121"/>
+          <w:sz w:val="24"/>
+        </w:rPr>
+      </w:pPr>
+      <w:r>
+        <w:rPr>
+          <w:rFonts w:hint="eastAsia" w:ascii="宋体" w:hAnsi="宋体" w:eastAsia="宋体" w:cs="宋体"/>
+          <w:color w:val="212121"/>
+          <w:sz w:val="24"/>
+        </w:rPr>
+        <w:t xml:space="preserve">出口确认必须由超声 + 门反馈共同完成（§10.4 原文「Sensors and gate </w:t>
+      </w:r>
+    </w:p>
+    <w:tbl>
+      <w:tblPr>
+        <w:tblStyle w:val="84mq3d"/>
+        <w:tblLayout w:type="fixed"/>
+      </w:tblPr>
+      <w:tblGrid>
+        <w:gridCol w:w="8280"/>
+      </w:tblGrid>
+      <w:tr>
+        <w:trPr/>
+        <w:tc>
+          <w:tcPr>
+            <w:tcW w:w="8280" w:type="dxa"/>
+            <w:tcBorders>
+              <w:top w:val="none"/>
+              <w:left w:val="single" w:color="1565C0" w:sz="24"/>
+              <w:bottom w:val="none"/>
+              <w:right w:val="none"/>
+            </w:tcBorders>
+            <w:shd w:val="clear" w:fill="F5F7FA"/>
+            <w:vAlign w:val="center"/>
+          </w:tcPr>
+          <w:p>
+            <w:pPr>
+              <w:rPr>
+                <w:rFonts w:hint="eastAsia" w:ascii="宋体" w:hAnsi="宋体" w:eastAsia="宋体" w:cs="宋体"/>
+                <w:color w:val="212121"/>
+                <w:sz w:val="24"/>
+              </w:rPr>
+            </w:pPr>
+            <w:r>
+              <w:rPr>
+                <w:rFonts w:hint="eastAsia" w:ascii="宋体" w:hAnsi="宋体" w:eastAsia="宋体" w:cs="宋体"/>
+                <w:b w:val="1"/>
+                <w:color w:val="212121"/>
+              </w:rPr>
+              <w:t>侧向监测不纳入基线设计：</w:t>
+            </w:r>
+            <w:r>
+              <w:rPr>
+                <w:rFonts w:hint="eastAsia" w:ascii="宋体" w:hAnsi="宋体" w:eastAsia="宋体" w:cs="宋体"/>
+                <w:color w:val="212121"/>
+              </w:rPr>
+              <w:t>它针对的「两头并排」已由尺寸约束在物理上排除（1.20 m 超出 800 mm 上限），「两头首尾」由 U-B1／U-B2 的通行时长与轮廓负责；没有侧向监测时最坏情况是多一个例外（转人工核验），不会造成错误身份。本表 6 个超声点与整合稿 §10.2 的 Six planned ultrasonic points (U-A, U-IN, U-B1, U-B2, U-N, U-Q) 完全一致。若试验中因偏心导致的读失败超过约定比例，再评估加装单侧探头（一个即可判断贴哪侧墙）。</w:t>
+            </w:r>
+          </w:p>
+        </w:tc>
+      </w:tr>
+    </w:tbl>
+    <w:p>
+      <w:pPr>
         <w:spacing w:after="180" w:line="384"/>
         <w:ind w:firstLine="480"/>
         <w:jc w:val="both"/>
@@ -5225,7 +5153,7 @@
           <w:color w:val="212121"/>
           <w:sz w:val="24"/>
         </w:rPr>
-        <w:t>出口确认必须由超声 + 门反馈共同完成（§10.4 原文「Sensors and gate feedback confirm exit; a timer alone cannot」），这也是 planned exit 与 actual exit 对账的数据来源。重启时控制器须先校验门位置与占位，再决定放行或清空赛道（§10.3），不得直接恢复被中断的动作。</w:t>
+        <w:t>feedback confirm exit; a timer alone cannot」），这也是 planned exit 与 actual exit 对账的数据来源。重启时控制器须先校验门位置与占位，再决定放行或清空赛道（§10.3），不得直接恢复被中断的动作。</w:t>
       </w:r>
     </w:p>
     <w:p>
@@ -6320,7 +6248,7 @@
     </w:tbl>
     <w:p>
       <w:pPr>
-        <w:pStyle w:val="000005"/>
+        <w:pStyle w:val="000002"/>
         <w:keepNext w:val="1"/>
         <w:keepLines w:val="1"/>
         <w:spacing w:before="528" w:beforeAutospacing="1" w:after="180" w:afterAutospacing="1" w:line="384"/>
@@ -6879,7 +6807,7 @@
                 <w:color w:val="212121"/>
                 <w:sz w:val="21"/>
               </w:rPr>
-              <w:t>横向偏移</w:t>
+              <w:t>读信号强度与读数一致性</w:t>
             </w:r>
           </w:p>
         </w:tc>
@@ -6913,7 +6841,7 @@
                 <w:color w:val="212121"/>
                 <w:sz w:val="21"/>
               </w:rPr>
-              <w:t>距中心 ±0.15 m 内</w:t>
+              <w:t>窗口内读信号强度稳定，且不同 EID 读数一致</w:t>
             </w:r>
           </w:p>
         </w:tc>
@@ -6947,7 +6875,7 @@
                 <w:color w:val="212121"/>
                 <w:sz w:val="21"/>
               </w:rPr>
-              <w:t>越限 → 读距不可比，判 uncertain</w:t>
+              <w:t>强度异常或读数不一致 → 读距不可比，判 uncertain</w:t>
             </w:r>
           </w:p>
         </w:tc>
@@ -7998,6 +7926,108 @@
           </w:p>
         </w:tc>
       </w:tr>
+      <w:tr>
+        <w:trPr/>
+        <w:tc>
+          <w:tcPr>
+            <w:tcW w:w="2159" w:type="dxa"/>
+            <w:tcBorders>
+              <w:top w:val="single" w:color="e0e0e0" w:sz="6"/>
+              <w:left w:val="single" w:color="e0e0e0" w:sz="6"/>
+              <w:bottom w:val="single" w:color="e0e0e0" w:sz="6"/>
+              <w:right w:val="single" w:color="e0e0e0" w:sz="6"/>
+            </w:tcBorders>
+            <w:tcMar>
+              <w:top w:w="108" w:type="dxa"/>
+              <w:left w:w="168" w:type="dxa"/>
+              <w:bottom w:w="108" w:type="dxa"/>
+              <w:right w:w="168" w:type="dxa"/>
+            </w:tcMar>
+            <w:vAlign w:val="top"/>
+          </w:tcPr>
+          <w:p>
+            <w:pPr>
+              <w:jc w:val="left"/>
+              <w:rPr>
+                <w:color w:val="212121"/>
+              </w:rPr>
+            </w:pPr>
+            <w:r>
+              <w:rPr>
+                <w:rFonts w:hint="eastAsia"/>
+                <w:color w:val="212121"/>
+              </w:rPr>
+              <w:t>偏心致读失败（无侧向监测时）</w:t>
+            </w:r>
+          </w:p>
+        </w:tc>
+        <w:tc>
+          <w:tcPr>
+            <w:tcW w:w="2325" w:type="dxa"/>
+            <w:tcBorders>
+              <w:top w:val="single" w:color="e0e0e0" w:sz="6"/>
+              <w:left w:val="single" w:color="e0e0e0" w:sz="6"/>
+              <w:bottom w:val="single" w:color="e0e0e0" w:sz="6"/>
+              <w:right w:val="single" w:color="e0e0e0" w:sz="6"/>
+            </w:tcBorders>
+            <w:tcMar>
+              <w:top w:w="108" w:type="dxa"/>
+              <w:left w:w="168" w:type="dxa"/>
+              <w:bottom w:w="108" w:type="dxa"/>
+              <w:right w:w="168" w:type="dxa"/>
+            </w:tcMar>
+            <w:vAlign w:val="top"/>
+          </w:tcPr>
+          <w:p>
+            <w:pPr>
+              <w:jc w:val="left"/>
+              <w:rPr>
+                <w:color w:val="212121"/>
+              </w:rPr>
+            </w:pPr>
+            <w:r>
+              <w:rPr>
+                <w:rFonts w:hint="eastAsia"/>
+                <w:color w:val="212121"/>
+              </w:rPr>
+              <w:t>由试验数据定（建议 ≤ 3%）</w:t>
+            </w:r>
+          </w:p>
+        </w:tc>
+        <w:tc>
+          <w:tcPr>
+            <w:tcW w:w="3822" w:type="dxa"/>
+            <w:tcBorders>
+              <w:top w:val="single" w:color="e0e0e0" w:sz="6"/>
+              <w:left w:val="single" w:color="e0e0e0" w:sz="6"/>
+              <w:bottom w:val="single" w:color="e0e0e0" w:sz="6"/>
+              <w:right w:val="single" w:color="e0e0e0" w:sz="6"/>
+            </w:tcBorders>
+            <w:tcMar>
+              <w:top w:w="108" w:type="dxa"/>
+              <w:left w:w="168" w:type="dxa"/>
+              <w:bottom w:w="108" w:type="dxa"/>
+              <w:right w:w="168" w:type="dxa"/>
+            </w:tcMar>
+            <w:vAlign w:val="top"/>
+          </w:tcPr>
+          <w:p>
+            <w:pPr>
+              <w:jc w:val="left"/>
+              <w:rPr>
+                <w:color w:val="212121"/>
+              </w:rPr>
+            </w:pPr>
+            <w:r>
+              <w:rPr>
+                <w:rFonts w:hint="eastAsia"/>
+                <w:color w:val="212121"/>
+              </w:rPr>
+              <w:t>转复核栏人工验证；持续超限则评估加装单侧探头</w:t>
+            </w:r>
+          </w:p>
+        </w:tc>
+      </w:tr>
     </w:tbl>
     <w:p>
       <w:pPr>
@@ -8019,7 +8049,7 @@
     </w:p>
     <w:p>
       <w:pPr>
-        <w:pStyle w:val="000005"/>
+        <w:pStyle w:val="000002"/>
         <w:keepNext w:val="1"/>
         <w:keepLines w:val="1"/>
         <w:spacing w:before="528" w:beforeAutospacing="1" w:after="180" w:afterAutospacing="1" w:line="384"/>
@@ -8745,7 +8775,7 @@
     </w:tbl>
     <w:p>
       <w:pPr>
-        <w:pStyle w:val="000005"/>
+        <w:pStyle w:val="000002"/>
         <w:keepNext w:val="1"/>
         <w:keepLines w:val="1"/>
         <w:spacing w:before="528" w:beforeAutospacing="1" w:after="180" w:afterAutospacing="1" w:line="384"/>
@@ -9825,7 +9855,7 @@
     </w:p>
     <w:p>
       <w:pPr>
-        <w:pStyle w:val="000005"/>
+        <w:pStyle w:val="000002"/>
         <w:keepNext w:val="1"/>
         <w:keepLines w:val="1"/>
         <w:spacing w:before="528" w:beforeAutospacing="1" w:after="180" w:afterAutospacing="1" w:line="384"/>
@@ -10888,7 +10918,7 @@
     </w:tbl>
     <w:p>
       <w:pPr>
-        <w:pStyle w:val="000005"/>
+        <w:pStyle w:val="000002"/>
         <w:keepNext w:val="1"/>
         <w:keepLines w:val="1"/>
         <w:spacing w:before="528" w:beforeAutospacing="1" w:after="180" w:afterAutospacing="1" w:line="384"/>
@@ -12095,7 +12125,7 @@
     </w:tbl>
     <w:p>
       <w:pPr>
-        <w:pStyle w:val="000005"/>
+        <w:pStyle w:val="000002"/>
         <w:keepNext w:val="1"/>
         <w:keepLines w:val="1"/>
         <w:spacing w:before="528" w:beforeAutospacing="1" w:after="180" w:afterAutospacing="1" w:line="384"/>
@@ -12582,7 +12612,9 @@
         <w:t>v2（2026-10-20），组员 4 整理</w:t>
       </w:r>
     </w:p>
-    <w:p/>
+    <w:p>
+      <w:pPr/>
+    </w:p>
     <w:sectPr>
       <w:footerReference r:id="rId5" w:type="default"/>
     </w:sectPr>
@@ -12674,99 +12706,147 @@
     </w:pPrDefault>
   </w:docDefaults>
   <w:latentStyles w:defLockedState="0" w:defUIPriority="99" w:defSemiHidden="0" w:defUnhideWhenUsed="0" w:defQFormat="0" w:count="88">
+    <w:lsdException w:name="List Number" w:semiHidden="1" w:unhideWhenUsed="1"/>
+    <w:lsdException w:name="toc 2" w:uiPriority="39" w:semiHidden="1" w:unhideWhenUsed="1"/>
+    <w:lsdException w:name="heading 5" w:uiPriority="9" w:semiHidden="1" w:unhideWhenUsed="1" w:qFormat="1"/>
+    <w:lsdException w:name="toc 1" w:uiPriority="39" w:semiHidden="1" w:unhideWhenUsed="1"/>
+    <w:lsdException w:name="List Bullet 4" w:semiHidden="1" w:unhideWhenUsed="1"/>
+    <w:lsdException w:name="heading 4" w:uiPriority="9" w:semiHidden="1" w:unhideWhenUsed="1" w:qFormat="1"/>
+    <w:lsdException w:name="Subtitle" w:uiPriority="11" w:qFormat="1"/>
+    <w:lsdException w:name="index 8" w:semiHidden="1" w:unhideWhenUsed="1"/>
+    <w:lsdException w:name="Body Text Indent" w:semiHidden="1" w:unhideWhenUsed="1"/>
+    <w:lsdException w:name="line number" w:semiHidden="1" w:unhideWhenUsed="1"/>
+    <w:lsdException w:name="List 2" w:semiHidden="1" w:unhideWhenUsed="1"/>
+    <w:lsdException w:name="Body Text 3" w:semiHidden="1" w:unhideWhenUsed="1"/>
+    <w:lsdException w:name="Body Text" w:semiHidden="1" w:unhideWhenUsed="1"/>
+    <w:lsdException w:name="table of figures" w:semiHidden="1" w:unhideWhenUsed="1"/>
+    <w:lsdException w:name="index heading" w:semiHidden="1" w:unhideWhenUsed="1"/>
+    <w:lsdException w:name="index 9" w:semiHidden="1" w:unhideWhenUsed="1"/>
+    <w:lsdException w:name="envelope address" w:semiHidden="1" w:unhideWhenUsed="1"/>
+    <w:lsdException w:name="Body Text First Indent" w:semiHidden="1" w:unhideWhenUsed="1"/>
+    <w:lsdException w:name="List Continue" w:semiHidden="1" w:unhideWhenUsed="1"/>
+    <w:lsdException w:name="Block Text" w:semiHidden="1" w:unhideWhenUsed="1"/>
+    <w:lsdException w:name="Message Header" w:semiHidden="1" w:unhideWhenUsed="1"/>
+    <w:lsdException w:name="index 3" w:semiHidden="1" w:unhideWhenUsed="1"/>
+    <w:lsdException w:name="List Continue 3" w:semiHidden="1" w:unhideWhenUsed="1"/>
+    <w:lsdException w:name="toc 6" w:uiPriority="39" w:semiHidden="1" w:unhideWhenUsed="1"/>
+    <w:lsdException w:name="Note Heading" w:semiHidden="1" w:unhideWhenUsed="1"/>
+    <w:lsdException w:name="heading 7" w:uiPriority="9" w:semiHidden="1" w:unhideWhenUsed="1" w:qFormat="1"/>
+    <w:lsdException w:name="Body Text 2" w:semiHidden="1" w:unhideWhenUsed="1"/>
+    <w:lsdException w:name="Normal" w:uiPriority="0" w:qFormat="1"/>
+    <w:lsdException w:name="toc 8" w:uiPriority="39" w:semiHidden="1" w:unhideWhenUsed="1"/>
+    <w:lsdException w:name="toc 7" w:uiPriority="39" w:semiHidden="1" w:unhideWhenUsed="1"/>
+    <w:lsdException w:name="Body Text Indent 2" w:semiHidden="1" w:unhideWhenUsed="1"/>
+    <w:lsdException w:name="index 4" w:semiHidden="1" w:unhideWhenUsed="1"/>
+    <w:lsdException w:name="heading 9" w:uiPriority="9" w:semiHidden="1" w:unhideWhenUsed="1" w:qFormat="1"/>
+    <w:lsdException w:name="toa heading" w:semiHidden="1" w:unhideWhenUsed="1"/>
+    <w:lsdException w:name="heading 2" w:uiPriority="9" w:semiHidden="1" w:unhideWhenUsed="1" w:qFormat="1"/>
+    <w:lsdException w:name="footer" w:semiHidden="1" w:unhideWhenUsed="1"/>
+    <w:lsdException w:name="toc 4" w:uiPriority="39" w:semiHidden="1" w:unhideWhenUsed="1"/>
+    <w:lsdException w:name="List Continue 5" w:semiHidden="1" w:unhideWhenUsed="1"/>
+    <w:lsdException w:name="heading 6" w:uiPriority="9" w:semiHidden="1" w:unhideWhenUsed="1" w:qFormat="1"/>
+    <w:lsdException w:name="heading 1" w:uiPriority="9" w:qFormat="1"/>
+    <w:lsdException w:name="caption" w:uiPriority="35" w:semiHidden="1" w:unhideWhenUsed="1" w:qFormat="1"/>
+    <w:lsdException w:name="Body Text Indent 3" w:semiHidden="1" w:unhideWhenUsed="1"/>
+    <w:lsdException w:name="envelope return" w:semiHidden="1" w:unhideWhenUsed="1"/>
     <w:lsdException w:name="index 5" w:semiHidden="1" w:unhideWhenUsed="1"/>
-    <w:lsdException w:name="Block Text" w:semiHidden="1" w:unhideWhenUsed="1"/>
+    <w:lsdException w:name="Closing" w:semiHidden="1" w:unhideWhenUsed="1"/>
+    <w:lsdException w:name="List Number 2" w:semiHidden="1" w:unhideWhenUsed="1"/>
+    <w:lsdException w:name="heading 3" w:uiPriority="9" w:semiHidden="1" w:unhideWhenUsed="1" w:qFormat="1"/>
+    <w:lsdException w:name="index 1" w:semiHidden="1" w:unhideWhenUsed="1"/>
+    <w:lsdException w:name="Signature" w:semiHidden="1" w:unhideWhenUsed="1"/>
+    <w:lsdException w:name="Normal Indent" w:semiHidden="1" w:unhideWhenUsed="1"/>
+    <w:lsdException w:name="annotation text" w:semiHidden="1" w:unhideWhenUsed="1"/>
+    <w:lsdException w:name="toc 9" w:uiPriority="39" w:semiHidden="1" w:unhideWhenUsed="1"/>
+    <w:lsdException w:name="List Continue 2" w:semiHidden="1" w:unhideWhenUsed="1"/>
+    <w:lsdException w:name="List Number 3" w:semiHidden="1" w:unhideWhenUsed="1"/>
     <w:lsdException w:name="annotation reference" w:semiHidden="1" w:unhideWhenUsed="1"/>
-    <w:lsdException w:name="List Bullet 2" w:semiHidden="1" w:unhideWhenUsed="1"/>
-    <w:lsdException w:name="Closing" w:semiHidden="1" w:unhideWhenUsed="1"/>
-    <w:lsdException w:name="toc 8" w:uiPriority="39" w:semiHidden="1" w:unhideWhenUsed="1"/>
-    <w:lsdException w:name="heading 3" w:uiPriority="9" w:semiHidden="1" w:unhideWhenUsed="1" w:qFormat="1"/>
     <w:lsdException w:name="table of authorities" w:semiHidden="1" w:unhideWhenUsed="1"/>
-    <w:lsdException w:name="endnote text" w:semiHidden="1" w:unhideWhenUsed="1"/>
-    <w:lsdException w:name="heading 7" w:uiPriority="9" w:semiHidden="1" w:unhideWhenUsed="1" w:qFormat="1"/>
-    <w:lsdException w:name="List 4" w:semiHidden="1" w:unhideWhenUsed="1"/>
-    <w:lsdException w:name="index 7" w:semiHidden="1" w:unhideWhenUsed="1"/>
-    <w:lsdException w:name="caption" w:uiPriority="35" w:semiHidden="1" w:unhideWhenUsed="1" w:qFormat="1"/>
-    <w:lsdException w:name="Date" w:semiHidden="1" w:unhideWhenUsed="1"/>
-    <w:lsdException w:name="List 3" w:semiHidden="1" w:unhideWhenUsed="1"/>
-    <w:lsdException w:name="toc 2" w:uiPriority="39" w:semiHidden="1" w:unhideWhenUsed="1"/>
-    <w:lsdException w:name="Normal" w:uiPriority="0" w:qFormat="1"/>
-    <w:lsdException w:name="toc 7" w:uiPriority="39" w:semiHidden="1" w:unhideWhenUsed="1"/>
-    <w:lsdException w:name="List Continue 4" w:semiHidden="1" w:unhideWhenUsed="1"/>
-    <w:lsdException w:name="toc 9" w:uiPriority="39" w:semiHidden="1" w:unhideWhenUsed="1"/>
-    <w:lsdException w:name="footnote reference" w:semiHidden="1" w:unhideWhenUsed="1"/>
-    <w:lsdException w:name="endnote reference" w:semiHidden="1" w:unhideWhenUsed="1"/>
-    <w:lsdException w:name="Message Header" w:semiHidden="1" w:unhideWhenUsed="1"/>
-    <w:lsdException w:name="Normal Indent" w:semiHidden="1" w:unhideWhenUsed="1"/>
-    <w:lsdException w:name="index 1" w:semiHidden="1" w:unhideWhenUsed="1"/>
-    <w:lsdException w:name="line number" w:semiHidden="1" w:unhideWhenUsed="1"/>
-    <w:lsdException w:name="heading 5" w:uiPriority="9" w:semiHidden="1" w:unhideWhenUsed="1" w:qFormat="1"/>
-    <w:lsdException w:name="Body Text Indent 3" w:semiHidden="1" w:unhideWhenUsed="1"/>
-    <w:lsdException w:name="Title" w:uiPriority="10" w:qFormat="1"/>
-    <w:lsdException w:name="List 5" w:semiHidden="1" w:unhideWhenUsed="1"/>
-    <w:lsdException w:name="List Number" w:semiHidden="1" w:unhideWhenUsed="1"/>
-    <w:lsdException w:name="toc 4" w:uiPriority="39" w:semiHidden="1" w:unhideWhenUsed="1"/>
-    <w:lsdException w:name="Subtitle" w:uiPriority="11" w:qFormat="1"/>
-    <w:lsdException w:name="Default Paragraph Font" w:uiPriority="1" w:semiHidden="1" w:unhideWhenUsed="1"/>
-    <w:lsdException w:name="index 4" w:semiHidden="1" w:unhideWhenUsed="1"/>
-    <w:lsdException w:name="heading 4" w:uiPriority="9" w:semiHidden="1" w:unhideWhenUsed="1" w:qFormat="1"/>
-    <w:lsdException w:name="envelope return" w:semiHidden="1" w:unhideWhenUsed="1"/>
-    <w:lsdException w:name="toc 1" w:uiPriority="39" w:semiHidden="1" w:unhideWhenUsed="1"/>
-    <w:lsdException w:name="List Continue 2" w:semiHidden="1" w:unhideWhenUsed="1"/>
-    <w:lsdException w:name="Body Text Indent 2" w:semiHidden="1" w:unhideWhenUsed="1"/>
-    <w:lsdException w:name="List Bullet 5" w:semiHidden="1" w:unhideWhenUsed="1"/>
-    <w:lsdException w:name="Strong" w:uiPriority="22" w:qFormat="1"/>
-    <w:lsdException w:name="List Continue" w:semiHidden="1" w:unhideWhenUsed="1"/>
-    <w:lsdException w:name="envelope address" w:semiHidden="1" w:unhideWhenUsed="1"/>
-    <w:lsdException w:name="FollowedHyperlink" w:semiHidden="1" w:unhideWhenUsed="1"/>
-    <w:lsdException w:name="List" w:semiHidden="1" w:unhideWhenUsed="1"/>
-    <w:lsdException w:name="List Bullet 4" w:semiHidden="1" w:unhideWhenUsed="1"/>
-    <w:lsdException w:name="heading 6" w:uiPriority="9" w:semiHidden="1" w:unhideWhenUsed="1" w:qFormat="1"/>
-    <w:lsdException w:name="toc 3" w:uiPriority="39" w:semiHidden="1" w:unhideWhenUsed="1"/>
-    <w:lsdException w:name="List 2" w:semiHidden="1" w:unhideWhenUsed="1"/>
-    <w:lsdException w:name="Body Text" w:semiHidden="1" w:unhideWhenUsed="1"/>
-    <w:lsdException w:name="Note Heading" w:semiHidden="1" w:unhideWhenUsed="1"/>
-    <w:lsdException w:name="Signature" w:semiHidden="1" w:unhideWhenUsed="1"/>
-    <w:lsdException w:name="Body Text First Indent 2" w:semiHidden="1" w:unhideWhenUsed="1"/>
     <w:lsdException w:name="Salutation" w:semiHidden="1" w:unhideWhenUsed="1"/>
-    <w:lsdException w:name="page number" w:semiHidden="1" w:unhideWhenUsed="1"/>
-    <w:lsdException w:name="List Number 3" w:semiHidden="1" w:unhideWhenUsed="1"/>
-    <w:lsdException w:name="toc 5" w:uiPriority="39" w:semiHidden="1" w:unhideWhenUsed="1"/>
-    <w:lsdException w:name="index 2" w:semiHidden="1" w:unhideWhenUsed="1"/>
-    <w:lsdException w:name="footnote text" w:semiHidden="1" w:unhideWhenUsed="1"/>
-    <w:lsdException w:name="List Bullet" w:semiHidden="1" w:unhideWhenUsed="1"/>
-    <w:lsdException w:name="List Bullet 3" w:semiHidden="1" w:unhideWhenUsed="1"/>
-    <w:lsdException w:name="table of figures" w:semiHidden="1" w:unhideWhenUsed="1"/>
-    <w:lsdException w:name="heading 8" w:uiPriority="9" w:semiHidden="1" w:unhideWhenUsed="1" w:qFormat="1"/>
-    <w:lsdException w:name="toc 6" w:uiPriority="39" w:semiHidden="1" w:unhideWhenUsed="1"/>
     <w:lsdException w:name="macro" w:semiHidden="1" w:unhideWhenUsed="1"/>
     <w:lsdException w:name="List Number 5" w:semiHidden="1" w:unhideWhenUsed="1"/>
-    <w:lsdException w:name="annotation text" w:semiHidden="1" w:unhideWhenUsed="1"/>
-    <w:lsdException w:name="heading 9" w:uiPriority="9" w:semiHidden="1" w:unhideWhenUsed="1" w:qFormat="1"/>
-    <w:lsdException w:name="Body Text 2" w:semiHidden="1" w:unhideWhenUsed="1"/>
-    <w:lsdException w:name="List Continue 5" w:semiHidden="1" w:unhideWhenUsed="1"/>
-    <w:lsdException w:name="Body Text 3" w:semiHidden="1" w:unhideWhenUsed="1"/>
-    <w:lsdException w:name="List Number 2" w:semiHidden="1" w:unhideWhenUsed="1"/>
-    <w:lsdException w:name="heading 2" w:uiPriority="9" w:semiHidden="1" w:unhideWhenUsed="1" w:qFormat="1"/>
+    <w:lsdException w:name="List 4" w:semiHidden="1" w:unhideWhenUsed="1"/>
+    <w:lsdException w:name="List Bullet 3" w:semiHidden="1" w:unhideWhenUsed="1"/>
+    <w:lsdException w:name="Date" w:semiHidden="1" w:unhideWhenUsed="1"/>
+    <w:lsdException w:name="Body Text First Indent 2" w:semiHidden="1" w:unhideWhenUsed="1"/>
+    <w:lsdException w:name="Strong" w:uiPriority="22" w:qFormat="1"/>
+    <w:lsdException w:name="footnote reference" w:semiHidden="1" w:unhideWhenUsed="1"/>
+    <w:lsdException w:name="Hyperlink" w:semiHidden="1" w:unhideWhenUsed="1"/>
+    <w:lsdException w:name="List Continue 4" w:semiHidden="1" w:unhideWhenUsed="1"/>
+    <w:lsdException w:name="List Bullet 5" w:semiHidden="1" w:unhideWhenUsed="1"/>
+    <w:lsdException w:name="index 6" w:semiHidden="1" w:unhideWhenUsed="1"/>
+    <w:lsdException w:name="List 5" w:semiHidden="1" w:unhideWhenUsed="1"/>
+    <w:lsdException w:name="List" w:semiHidden="1" w:unhideWhenUsed="1"/>
+    <w:lsdException w:name="FollowedHyperlink" w:semiHidden="1" w:unhideWhenUsed="1"/>
     <w:lsdException w:name="header" w:semiHidden="1" w:unhideWhenUsed="1"/>
-    <w:lsdException w:name="index heading" w:semiHidden="1" w:unhideWhenUsed="1"/>
-    <w:lsdException w:name="Body Text Indent" w:semiHidden="1" w:unhideWhenUsed="1"/>
-    <w:lsdException w:name="index 6" w:semiHidden="1" w:unhideWhenUsed="1"/>
-    <w:lsdException w:name="Body Text First Indent" w:semiHidden="1" w:unhideWhenUsed="1"/>
-    <w:lsdException w:name="Hyperlink" w:semiHidden="1" w:unhideWhenUsed="1"/>
-    <w:lsdException w:name="List Continue 3" w:semiHidden="1" w:unhideWhenUsed="1"/>
-    <w:lsdException w:name="index 9" w:semiHidden="1" w:unhideWhenUsed="1"/>
-    <w:lsdException w:name="index 3" w:semiHidden="1" w:unhideWhenUsed="1"/>
-    <w:lsdException w:name="index 8" w:semiHidden="1" w:unhideWhenUsed="1"/>
+    <w:lsdException w:name="Default Paragraph Font" w:uiPriority="1" w:semiHidden="1" w:unhideWhenUsed="1"/>
+    <w:lsdException w:name="index 2" w:semiHidden="1" w:unhideWhenUsed="1"/>
+    <w:lsdException w:name="endnote reference" w:semiHidden="1" w:unhideWhenUsed="1"/>
+    <w:lsdException w:name="heading 8" w:uiPriority="9" w:semiHidden="1" w:unhideWhenUsed="1" w:qFormat="1"/>
+    <w:lsdException w:name="List Bullet 2" w:semiHidden="1" w:unhideWhenUsed="1"/>
+    <w:lsdException w:name="page number" w:semiHidden="1" w:unhideWhenUsed="1"/>
+    <w:lsdException w:name="footnote text" w:semiHidden="1" w:unhideWhenUsed="1"/>
+    <w:lsdException w:name="toc 5" w:uiPriority="39" w:semiHidden="1" w:unhideWhenUsed="1"/>
+    <w:lsdException w:name="index 7" w:semiHidden="1" w:unhideWhenUsed="1"/>
+    <w:lsdException w:name="List Bullet" w:semiHidden="1" w:unhideWhenUsed="1"/>
+    <w:lsdException w:name="Title" w:uiPriority="10" w:qFormat="1"/>
+    <w:lsdException w:name="List 3" w:semiHidden="1" w:unhideWhenUsed="1"/>
+    <w:lsdException w:name="toc 3" w:uiPriority="39" w:semiHidden="1" w:unhideWhenUsed="1"/>
+    <w:lsdException w:name="endnote text" w:semiHidden="1" w:unhideWhenUsed="1"/>
     <w:lsdException w:name="List Number 4" w:semiHidden="1" w:unhideWhenUsed="1"/>
-    <w:lsdException w:name="toa heading" w:semiHidden="1" w:unhideWhenUsed="1"/>
-    <w:lsdException w:name="heading 1" w:uiPriority="9" w:qFormat="1"/>
-    <w:lsdException w:name="footer" w:semiHidden="1" w:unhideWhenUsed="1"/>
   </w:latentStyles>
   <w:style w:type="paragraph" w:styleId="000005">
+    <w:name w:val="toc 2"/>
+    <w:basedOn w:val="000003"/>
+    <w:qFormat w:val="1"/>
+    <w:pPr>
+      <w:tabs>
+        <w:tab w:val="right" w:leader="dot" w:pos="9072"/>
+      </w:tabs>
+      <w:spacing w:after="60" w:line="360"/>
+      <w:ind w:left="420"/>
+    </w:pPr>
+    <w:rPr>
+      <w:rFonts w:ascii="SimSun" w:hAnsi="SimSun" w:eastAsia="SimSun" w:cs="SimSun"/>
+      <w:sz w:val="24"/>
+      <w:szCs w:val="24"/>
+    </w:rPr>
+  </w:style>
+  <w:style w:type="paragraph" w:styleId="000004">
+    <w:name w:val="toc 1"/>
+    <w:basedOn w:val="000003"/>
+    <w:qFormat w:val="1"/>
+    <w:pPr>
+      <w:tabs>
+        <w:tab w:val="right" w:leader="dot" w:pos="9072"/>
+      </w:tabs>
+      <w:spacing w:before="120" w:after="120" w:line="360"/>
+    </w:pPr>
+    <w:rPr>
+      <w:rFonts w:ascii="SimSun" w:hAnsi="SimSun" w:eastAsia="SimSun" w:cs="SimSun"/>
+      <w:sz w:val="24"/>
+      <w:szCs w:val="24"/>
+    </w:rPr>
+  </w:style>
+  <w:style w:type="table" w:styleId="84mq3d">
+    <w:name w:val="Table Grid"/>
+    <w:basedOn w:val="aelxla"/>
+    <w:uiPriority w:val="39"/>
+    <w:tblPr>
+      <w:tblBorders>
+        <w:top w:val="single" w:color="CBCDD1" w:sz="6" w:space="0"/>
+        <w:left w:val="single" w:color="CBCDD1" w:sz="6" w:space="0"/>
+        <w:bottom w:val="single" w:color="CBCDD1" w:sz="6" w:space="0"/>
+        <w:right w:val="single" w:color="CBCDD1" w:sz="6" w:space="0"/>
+        <w:insideH w:val="single" w:color="CBCDD1" w:sz="6" w:space="0"/>
+        <w:insideV w:val="single" w:color="CBCDD1" w:sz="6" w:space="0"/>
+      </w:tblBorders>
+    </w:tblPr>
+  </w:style>
+  <w:style w:type="paragraph" w:styleId="000002">
     <w:name w:val="heading 2"/>
-    <w:basedOn w:val="Normal"/>
-    <w:next w:val="Normal"/>
+    <w:basedOn w:val="000003"/>
+    <w:next w:val="000003"/>
     <w:uiPriority w:val="9"/>
     <w:qFormat w:val="1"/>
     <w:pPr>
@@ -12781,43 +12861,10 @@
       <w:szCs w:val="26"/>
     </w:rPr>
   </w:style>
-  <w:style w:type="paragraph" w:styleId="000003">
-    <w:name w:val="toc 1"/>
-    <w:basedOn w:val="Normal"/>
-    <w:qFormat w:val="1"/>
-    <w:pPr>
-      <w:tabs>
-        <w:tab w:val="right" w:leader="dot" w:pos="9072"/>
-      </w:tabs>
-      <w:spacing w:before="120" w:after="120" w:line="360"/>
-    </w:pPr>
-    <w:rPr>
-      <w:rFonts w:ascii="SimSun" w:hAnsi="SimSun" w:eastAsia="SimSun" w:cs="SimSun"/>
-      <w:sz w:val="24"/>
-      <w:szCs w:val="24"/>
-    </w:rPr>
-  </w:style>
-  <w:style w:type="paragraph" w:styleId="000004">
-    <w:name w:val="toc 2"/>
-    <w:basedOn w:val="Normal"/>
-    <w:qFormat w:val="1"/>
-    <w:pPr>
-      <w:tabs>
-        <w:tab w:val="right" w:leader="dot" w:pos="9072"/>
-      </w:tabs>
-      <w:spacing w:after="60" w:line="360"/>
-      <w:ind w:left="420"/>
-    </w:pPr>
-    <w:rPr>
-      <w:rFonts w:ascii="SimSun" w:hAnsi="SimSun" w:eastAsia="SimSun" w:cs="SimSun"/>
-      <w:sz w:val="24"/>
-      <w:szCs w:val="24"/>
-    </w:rPr>
-  </w:style>
   <w:style w:type="paragraph" w:styleId="000006">
     <w:name w:val="heading 3"/>
-    <w:basedOn w:val="Normal"/>
-    <w:next w:val="Normal"/>
+    <w:basedOn w:val="000003"/>
+    <w:next w:val="000003"/>
     <w:uiPriority w:val="9"/>
     <w:qFormat w:val="1"/>
     <w:pPr>
@@ -12830,6 +12877,34 @@
       <w:b w:val="1"/>
       <w:sz w:val="24"/>
       <w:szCs w:val="24"/>
+    </w:rPr>
+  </w:style>
+  <w:style w:type="table" w:styleId="aelxla" w:default="1">
+    <w:name w:val="Normal Table"/>
+    <w:uiPriority w:val="99"/>
+    <w:semiHidden w:val="1"/>
+    <w:unhideWhenUsed w:val="1"/>
+    <w:tblPr>
+      <w:tblInd w:w="0" w:type="dxa"/>
+      <w:tblCellMar>
+        <w:top w:w="0" w:type="dxa"/>
+        <w:left w:w="108" w:type="dxa"/>
+        <w:bottom w:w="0" w:type="dxa"/>
+        <w:right w:w="108" w:type="dxa"/>
+      </w:tblCellMar>
+    </w:tblPr>
+    <w:tcPr>
+      <w:vAlign w:val="center"/>
+    </w:tcPr>
+  </w:style>
+  <w:style w:type="paragraph" w:styleId="x5b1eo" w:default="1">
+    <w:name w:val="Normal"/>
+    <w:pPr>
+      <w:widowControl w:val="0"/>
+      <w:jc w:val="left"/>
+    </w:pPr>
+    <w:rPr>
+      <w:rFonts/>
     </w:rPr>
   </w:style>
 </w:styles>

</xml_diff>

<commit_message>
Memo v2.1: slim ultrasonic layout 6 -> 4 points per user decision - U-B1 (B entry) + U-B2 (B exit) + U-N (normal-return branch) + U-E (review branch)
- Equipment table: drop U-A/U-IN/U-N/U-Q rows; branch sensors now confirm actual exit route (strengthens P4 reconciliation)
- Flow table: admission via bounded G0 window (A section unsensed - deliberate trade-off, non-identity-critical, failure mode is an extra exception not a wrong identity); B1 trigger closes G1; branch sensors confirm exit
- Threshold table: drop profile-peak-width (no continuous profile with 2 points); add two-beam-coverage rule (uncovered middle stretch 0.9m < min body length 1.45m, a cow cannot hide between beams); passage timing now B1-trigger to B2-trigger; exit check via U-N/U-E + gate feedback
- Note block rewritten: where the dropped sensors' duties went; draft 10.2 six-point enumeration must be updated to four (sync table updated); residual-risk wording aligned
</commit_message>
<xml_diff>
--- a/08_组员资料/组内备忘_ID-Coo单牛自动判定与例外处理技术方案_v2全自动版_20261020.docx
+++ b/08_组员资料/组内备忘_ID-Coo单牛自动判定与例外处理技术方案_v2全自动版_20261020.docx
@@ -606,7 +606,7 @@
     </w:p>
     <w:p>
       <w:pPr>
-        <w:pStyle w:val="000004"/>
+        <w:pStyle w:val="000008"/>
         <w:tabs>
           <w:tab w:val="right" w:leader="dot" w:pos="9072"/>
         </w:tabs>
@@ -660,7 +660,7 @@
     </w:p>
     <w:p>
       <w:pPr>
-        <w:pStyle w:val="000004"/>
+        <w:pStyle w:val="000008"/>
         <w:tabs>
           <w:tab w:val="right" w:leader="dot" w:pos="9072"/>
         </w:tabs>
@@ -705,7 +705,7 @@
     </w:p>
     <w:p>
       <w:pPr>
-        <w:pStyle w:val="000005"/>
+        <w:pStyle w:val="000006"/>
         <w:tabs>
           <w:tab w:val="right" w:leader="dot" w:pos="9072"/>
         </w:tabs>
@@ -750,7 +750,7 @@
     </w:p>
     <w:p>
       <w:pPr>
-        <w:pStyle w:val="000005"/>
+        <w:pStyle w:val="000006"/>
         <w:tabs>
           <w:tab w:val="right" w:leader="dot" w:pos="9072"/>
         </w:tabs>
@@ -795,7 +795,7 @@
     </w:p>
     <w:p>
       <w:pPr>
-        <w:pStyle w:val="000004"/>
+        <w:pStyle w:val="000008"/>
         <w:tabs>
           <w:tab w:val="right" w:leader="dot" w:pos="9072"/>
         </w:tabs>
@@ -840,7 +840,7 @@
     </w:p>
     <w:p>
       <w:pPr>
-        <w:pStyle w:val="000004"/>
+        <w:pStyle w:val="000008"/>
         <w:tabs>
           <w:tab w:val="right" w:leader="dot" w:pos="9072"/>
         </w:tabs>
@@ -885,7 +885,7 @@
     </w:p>
     <w:p>
       <w:pPr>
-        <w:pStyle w:val="000004"/>
+        <w:pStyle w:val="000008"/>
         <w:tabs>
           <w:tab w:val="right" w:leader="dot" w:pos="9072"/>
         </w:tabs>
@@ -930,7 +930,7 @@
     </w:p>
     <w:p>
       <w:pPr>
-        <w:pStyle w:val="000005"/>
+        <w:pStyle w:val="000006"/>
         <w:tabs>
           <w:tab w:val="right" w:leader="dot" w:pos="9072"/>
         </w:tabs>
@@ -975,7 +975,7 @@
     </w:p>
     <w:p>
       <w:pPr>
-        <w:pStyle w:val="000005"/>
+        <w:pStyle w:val="000006"/>
         <w:tabs>
           <w:tab w:val="right" w:leader="dot" w:pos="9072"/>
         </w:tabs>
@@ -1020,7 +1020,7 @@
     </w:p>
     <w:p>
       <w:pPr>
-        <w:pStyle w:val="000004"/>
+        <w:pStyle w:val="000008"/>
         <w:tabs>
           <w:tab w:val="right" w:leader="dot" w:pos="9072"/>
         </w:tabs>
@@ -1065,7 +1065,7 @@
     </w:p>
     <w:p>
       <w:pPr>
-        <w:pStyle w:val="000004"/>
+        <w:pStyle w:val="000008"/>
         <w:tabs>
           <w:tab w:val="right" w:leader="dot" w:pos="9072"/>
         </w:tabs>
@@ -1110,7 +1110,7 @@
     </w:p>
     <w:p>
       <w:pPr>
-        <w:pStyle w:val="000004"/>
+        <w:pStyle w:val="000008"/>
         <w:tabs>
           <w:tab w:val="right" w:leader="dot" w:pos="9072"/>
         </w:tabs>
@@ -1155,7 +1155,7 @@
     </w:p>
     <w:p>
       <w:pPr>
-        <w:pStyle w:val="000004"/>
+        <w:pStyle w:val="000008"/>
         <w:tabs>
           <w:tab w:val="right" w:leader="dot" w:pos="9072"/>
         </w:tabs>
@@ -1200,7 +1200,7 @@
     </w:p>
     <w:p>
       <w:pPr>
-        <w:pStyle w:val="000004"/>
+        <w:pStyle w:val="000008"/>
         <w:tabs>
           <w:tab w:val="right" w:leader="dot" w:pos="9072"/>
         </w:tabs>
@@ -1245,7 +1245,7 @@
     </w:p>
     <w:p>
       <w:pPr>
-        <w:pStyle w:val="000004"/>
+        <w:pStyle w:val="000008"/>
         <w:tabs>
           <w:tab w:val="right" w:leader="dot" w:pos="9072"/>
         </w:tabs>
@@ -1431,7 +1431,7 @@
                 <w:color w:val="212121"/>
                 <w:sz w:val="24"/>
               </w:rPr>
-              <w:t>尺寸约束 + 双门关闭 + 单牛轮廓／时间模板</w:t>
+              <w:t>尺寸约束 + 双门关闭 + 两端波束覆盖与通行时长模板</w:t>
             </w:r>
             <w:r>
               <w:rPr>
@@ -1465,7 +1465,7 @@
     </w:tbl>
     <w:p>
       <w:pPr>
-        <w:pStyle w:val="000002"/>
+        <w:pStyle w:val="00000b"/>
         <w:keepNext w:val="1"/>
         <w:keepLines w:val="1"/>
         <w:spacing w:before="528" w:beforeAutospacing="1" w:after="180" w:afterAutospacing="1" w:line="384"/>
@@ -2402,7 +2402,7 @@
     </w:tbl>
     <w:p>
       <w:pPr>
-        <w:pStyle w:val="000002"/>
+        <w:pStyle w:val="00000b"/>
         <w:keepNext w:val="1"/>
         <w:keepLines w:val="1"/>
         <w:spacing w:before="528" w:beforeAutospacing="1" w:after="180" w:afterAutospacing="1" w:line="384"/>
@@ -2446,7 +2446,7 @@
     </w:p>
     <w:p>
       <w:pPr>
-        <w:pStyle w:val="000006"/>
+        <w:pStyle w:val="00000c"/>
         <w:keepNext w:val="1"/>
         <w:keepLines w:val="1"/>
         <w:spacing w:before="288" w:beforeAutospacing="1" w:after="180" w:afterAutospacing="1" w:line="384"/>
@@ -2518,7 +2518,7 @@
                 <w:color w:val="212121"/>
                 <w:sz w:val="24"/>
               </w:rPr>
-              <w:t>① B 段尺寸装不下两头 + ② G1／G2 两端门均关闭 + ③ 轮廓与停留时间符合单牛模板 ⇒ B 内恰好一头</w:t>
+              <w:t>① B 段尺寸装不下两头 + ② G1／G2 两端门均关闭 + ③ 两端波束覆盖与通行时长符合单牛模板 ⇒ B 内恰好一头</w:t>
             </w:r>
           </w:p>
         </w:tc>
@@ -2660,7 +2660,7 @@
     </w:p>
     <w:p>
       <w:pPr>
-        <w:pStyle w:val="000006"/>
+        <w:pStyle w:val="00000c"/>
         <w:keepNext w:val="1"/>
         <w:keepLines w:val="1"/>
         <w:spacing w:before="288" w:beforeAutospacing="1" w:after="180" w:afterAutospacing="1" w:line="384"/>
@@ -3690,7 +3690,7 @@
     </w:tbl>
     <w:p>
       <w:pPr>
-        <w:pStyle w:val="000002"/>
+        <w:pStyle w:val="00000b"/>
         <w:keepNext w:val="1"/>
         <w:keepLines w:val="1"/>
         <w:spacing w:before="528" w:beforeAutospacing="1" w:after="180" w:afterAutospacing="1" w:line="384"/>
@@ -4015,7 +4015,7 @@
                 <w:color w:val="212121"/>
                 <w:sz w:val="21"/>
               </w:rPr>
-              <w:t>B 段纵向第 1 点上方约 1.8–2.0 m，顶视</w:t>
+              <w:t>B 段入口（G1 内侧上方约 1.8–2.0 m，顶视）</w:t>
             </w:r>
           </w:p>
         </w:tc>
@@ -4049,7 +4049,7 @@
                 <w:color w:val="212121"/>
                 <w:sz w:val="21"/>
               </w:rPr>
-              <w:t>高度轮廓（前半段：肩/背线）</w:t>
+              <w:t>入口占位触发：牛进入 B 段即触发，作为关闭 G1 的依据</w:t>
             </w:r>
           </w:p>
         </w:tc>
@@ -4154,7 +4154,7 @@
                 <w:color w:val="212121"/>
                 <w:sz w:val="21"/>
               </w:rPr>
-              <w:t>B 段纵向第 2 点上方同高，顶视</w:t>
+              <w:t>B 段出口（G2 内侧上方同高，顶视）</w:t>
             </w:r>
           </w:p>
         </w:tc>
@@ -4188,7 +4188,7 @@
                 <w:color w:val="212121"/>
                 <w:sz w:val="21"/>
               </w:rPr>
-              <w:t>高度轮廓（后半段：躯干/髋），与 U-B1 交叉确认</w:t>
+              <w:t>出口占位触发：与 U-B1 合计通行时长，并确认 B 段清空</w:t>
             </w:r>
           </w:p>
         </w:tc>
@@ -4225,7 +4225,7 @@
                 <w:color w:val="212121"/>
                 <w:sz w:val="21"/>
               </w:rPr>
-              <w:t>U-A</w:t>
+              <w:t>U-N</w:t>
             </w:r>
           </w:p>
         </w:tc>
@@ -4293,7 +4293,7 @@
                 <w:color w:val="212121"/>
                 <w:sz w:val="21"/>
               </w:rPr>
-              <w:t>A 缓冲段</w:t>
+              <w:t>正常回转通道（D 之后）</w:t>
             </w:r>
           </w:p>
         </w:tc>
@@ -4327,7 +4327,7 @@
                 <w:color w:val="212121"/>
                 <w:sz w:val="21"/>
               </w:rPr>
-              <w:t>占位检测：A 段作队列缓冲</w:t>
+              <w:t>实际出口确认：牛已进入正常回转</w:t>
             </w:r>
           </w:p>
         </w:tc>
@@ -4364,7 +4364,7 @@
                 <w:color w:val="212121"/>
                 <w:sz w:val="21"/>
               </w:rPr>
-              <w:t>U-IN</w:t>
+              <w:t>U-E</w:t>
             </w:r>
           </w:p>
         </w:tc>
@@ -4432,7 +4432,7 @@
                 <w:color w:val="212121"/>
                 <w:sz w:val="21"/>
               </w:rPr>
-              <w:t>入口</w:t>
+              <w:t>复核支路（H 之后）</w:t>
             </w:r>
           </w:p>
         </w:tc>
@@ -4466,285 +4466,7 @@
                 <w:color w:val="212121"/>
                 <w:sz w:val="21"/>
               </w:rPr>
-              <w:t>占位 + 通行检测</w:t>
-            </w:r>
-          </w:p>
-        </w:tc>
-      </w:tr>
-      <w:tr>
-        <w:trPr/>
-        <w:tc>
-          <w:tcPr>
-            <w:tcW w:w="1079" w:type="dxa"/>
-            <w:tcBorders>
-              <w:top w:val="single" w:color="e0e0e0" w:sz="6"/>
-              <w:left w:val="single" w:color="e0e0e0" w:sz="6"/>
-              <w:bottom w:val="single" w:color="e0e0e0" w:sz="6"/>
-              <w:right w:val="single" w:color="e0e0e0" w:sz="6"/>
-            </w:tcBorders>
-            <w:tcMar>
-              <w:top w:w="108" w:type="dxa"/>
-              <w:left w:w="168" w:type="dxa"/>
-              <w:bottom w:w="108" w:type="dxa"/>
-              <w:right w:w="168" w:type="dxa"/>
-            </w:tcMar>
-            <w:vAlign w:val="top"/>
-          </w:tcPr>
-          <w:p>
-            <w:pPr>
-              <w:jc w:val="left"/>
-              <w:rPr>
-                <w:color w:val="212121"/>
-              </w:rPr>
-            </w:pPr>
-            <w:r>
-              <w:rPr>
-                <w:rFonts w:ascii="宋体" w:hAnsi="宋体" w:eastAsia="宋体" w:cs="宋体"/>
-                <w:color w:val="212121"/>
-                <w:sz w:val="21"/>
-              </w:rPr>
-              <w:t>U-N</w:t>
-            </w:r>
-          </w:p>
-        </w:tc>
-        <w:tc>
-          <w:tcPr>
-            <w:tcW w:w="2408" w:type="dxa"/>
-            <w:tcBorders>
-              <w:top w:val="single" w:color="e0e0e0" w:sz="6"/>
-              <w:left w:val="single" w:color="e0e0e0" w:sz="6"/>
-              <w:bottom w:val="single" w:color="e0e0e0" w:sz="6"/>
-              <w:right w:val="single" w:color="e0e0e0" w:sz="6"/>
-            </w:tcBorders>
-            <w:tcMar>
-              <w:top w:w="108" w:type="dxa"/>
-              <w:left w:w="168" w:type="dxa"/>
-              <w:bottom w:w="108" w:type="dxa"/>
-              <w:right w:w="168" w:type="dxa"/>
-            </w:tcMar>
-            <w:vAlign w:val="top"/>
-          </w:tcPr>
-          <w:p>
-            <w:pPr>
-              <w:jc w:val="left"/>
-              <w:rPr>
-                <w:color w:val="212121"/>
-              </w:rPr>
-            </w:pPr>
-            <w:r>
-              <w:rPr>
-                <w:rFonts w:hint="eastAsia" w:ascii="宋体" w:hAnsi="宋体" w:eastAsia="宋体" w:cs="宋体"/>
-                <w:color w:val="212121"/>
-                <w:sz w:val="21"/>
-              </w:rPr>
-              <w:t>同上</w:t>
-            </w:r>
-          </w:p>
-        </w:tc>
-        <w:tc>
-          <w:tcPr>
-            <w:tcW w:w="2159" w:type="dxa"/>
-            <w:tcBorders>
-              <w:top w:val="single" w:color="e0e0e0" w:sz="6"/>
-              <w:left w:val="single" w:color="e0e0e0" w:sz="6"/>
-              <w:bottom w:val="single" w:color="e0e0e0" w:sz="6"/>
-              <w:right w:val="single" w:color="e0e0e0" w:sz="6"/>
-            </w:tcBorders>
-            <w:tcMar>
-              <w:top w:w="108" w:type="dxa"/>
-              <w:left w:w="168" w:type="dxa"/>
-              <w:bottom w:w="108" w:type="dxa"/>
-              <w:right w:w="168" w:type="dxa"/>
-            </w:tcMar>
-            <w:vAlign w:val="top"/>
-          </w:tcPr>
-          <w:p>
-            <w:pPr>
-              <w:jc w:val="left"/>
-              <w:rPr>
-                <w:color w:val="212121"/>
-              </w:rPr>
-            </w:pPr>
-            <w:r>
-              <w:rPr>
-                <w:rFonts w:hint="eastAsia" w:ascii="宋体" w:hAnsi="宋体" w:eastAsia="宋体" w:cs="宋体"/>
-                <w:color w:val="212121"/>
-                <w:sz w:val="21"/>
-              </w:rPr>
-              <w:t>邻接区</w:t>
-            </w:r>
-          </w:p>
-        </w:tc>
-        <w:tc>
-          <w:tcPr>
-            <w:tcW w:w="2660" w:type="dxa"/>
-            <w:tcBorders>
-              <w:top w:val="single" w:color="e0e0e0" w:sz="6"/>
-              <w:left w:val="single" w:color="e0e0e0" w:sz="6"/>
-              <w:bottom w:val="single" w:color="e0e0e0" w:sz="6"/>
-              <w:right w:val="single" w:color="e0e0e0" w:sz="6"/>
-            </w:tcBorders>
-            <w:tcMar>
-              <w:top w:w="108" w:type="dxa"/>
-              <w:left w:w="168" w:type="dxa"/>
-              <w:bottom w:w="108" w:type="dxa"/>
-              <w:right w:w="168" w:type="dxa"/>
-            </w:tcMar>
-            <w:vAlign w:val="top"/>
-          </w:tcPr>
-          <w:p>
-            <w:pPr>
-              <w:jc w:val="left"/>
-              <w:rPr>
-                <w:color w:val="212121"/>
-              </w:rPr>
-            </w:pPr>
-            <w:r>
-              <w:rPr>
-                <w:rFonts w:hint="eastAsia" w:ascii="宋体" w:hAnsi="宋体" w:eastAsia="宋体" w:cs="宋体"/>
-                <w:color w:val="212121"/>
-                <w:sz w:val="21"/>
-              </w:rPr>
-              <w:t>邻标签/邻牛监测</w:t>
-            </w:r>
-          </w:p>
-        </w:tc>
-      </w:tr>
-      <w:tr>
-        <w:trPr/>
-        <w:tc>
-          <w:tcPr>
-            <w:tcW w:w="1079" w:type="dxa"/>
-            <w:tcBorders>
-              <w:top w:val="single" w:color="e0e0e0" w:sz="6"/>
-              <w:left w:val="single" w:color="e0e0e0" w:sz="6"/>
-              <w:bottom w:val="single" w:color="e0e0e0" w:sz="6"/>
-              <w:right w:val="single" w:color="e0e0e0" w:sz="6"/>
-            </w:tcBorders>
-            <w:tcMar>
-              <w:top w:w="108" w:type="dxa"/>
-              <w:left w:w="168" w:type="dxa"/>
-              <w:bottom w:w="108" w:type="dxa"/>
-              <w:right w:w="168" w:type="dxa"/>
-            </w:tcMar>
-            <w:vAlign w:val="top"/>
-          </w:tcPr>
-          <w:p>
-            <w:pPr>
-              <w:jc w:val="left"/>
-              <w:rPr>
-                <w:color w:val="212121"/>
-              </w:rPr>
-            </w:pPr>
-            <w:r>
-              <w:rPr>
-                <w:rFonts w:ascii="宋体" w:hAnsi="宋体" w:eastAsia="宋体" w:cs="宋体"/>
-                <w:color w:val="212121"/>
-                <w:sz w:val="21"/>
-              </w:rPr>
-              <w:t>U-Q</w:t>
-            </w:r>
-          </w:p>
-        </w:tc>
-        <w:tc>
-          <w:tcPr>
-            <w:tcW w:w="2408" w:type="dxa"/>
-            <w:tcBorders>
-              <w:top w:val="single" w:color="e0e0e0" w:sz="6"/>
-              <w:left w:val="single" w:color="e0e0e0" w:sz="6"/>
-              <w:bottom w:val="single" w:color="e0e0e0" w:sz="6"/>
-              <w:right w:val="single" w:color="e0e0e0" w:sz="6"/>
-            </w:tcBorders>
-            <w:tcMar>
-              <w:top w:w="108" w:type="dxa"/>
-              <w:left w:w="168" w:type="dxa"/>
-              <w:bottom w:w="108" w:type="dxa"/>
-              <w:right w:w="168" w:type="dxa"/>
-            </w:tcMar>
-            <w:vAlign w:val="top"/>
-          </w:tcPr>
-          <w:p>
-            <w:pPr>
-              <w:jc w:val="left"/>
-              <w:rPr>
-                <w:color w:val="212121"/>
-              </w:rPr>
-            </w:pPr>
-            <w:r>
-              <w:rPr>
-                <w:rFonts w:hint="eastAsia" w:ascii="宋体" w:hAnsi="宋体" w:eastAsia="宋体" w:cs="宋体"/>
-                <w:color w:val="212121"/>
-                <w:sz w:val="21"/>
-              </w:rPr>
-              <w:t>同上</w:t>
-            </w:r>
-          </w:p>
-        </w:tc>
-        <w:tc>
-          <w:tcPr>
-            <w:tcW w:w="2159" w:type="dxa"/>
-            <w:tcBorders>
-              <w:top w:val="single" w:color="e0e0e0" w:sz="6"/>
-              <w:left w:val="single" w:color="e0e0e0" w:sz="6"/>
-              <w:bottom w:val="single" w:color="e0e0e0" w:sz="6"/>
-              <w:right w:val="single" w:color="e0e0e0" w:sz="6"/>
-            </w:tcBorders>
-            <w:tcMar>
-              <w:top w:w="108" w:type="dxa"/>
-              <w:left w:w="168" w:type="dxa"/>
-              <w:bottom w:w="108" w:type="dxa"/>
-              <w:right w:w="168" w:type="dxa"/>
-            </w:tcMar>
-            <w:vAlign w:val="top"/>
-          </w:tcPr>
-          <w:p>
-            <w:pPr>
-              <w:jc w:val="left"/>
-              <w:rPr>
-                <w:color w:val="212121"/>
-              </w:rPr>
-            </w:pPr>
-            <w:r>
-              <w:rPr>
-                <w:rFonts w:hint="eastAsia" w:ascii="宋体" w:hAnsi="宋体" w:eastAsia="宋体" w:cs="宋体"/>
-                <w:color w:val="212121"/>
-                <w:sz w:val="21"/>
-              </w:rPr>
-              <w:t>排队区</w:t>
-            </w:r>
-          </w:p>
-        </w:tc>
-        <w:tc>
-          <w:tcPr>
-            <w:tcW w:w="2660" w:type="dxa"/>
-            <w:tcBorders>
-              <w:top w:val="single" w:color="e0e0e0" w:sz="6"/>
-              <w:left w:val="single" w:color="e0e0e0" w:sz="6"/>
-              <w:bottom w:val="single" w:color="e0e0e0" w:sz="6"/>
-              <w:right w:val="single" w:color="e0e0e0" w:sz="6"/>
-            </w:tcBorders>
-            <w:tcMar>
-              <w:top w:w="108" w:type="dxa"/>
-              <w:left w:w="168" w:type="dxa"/>
-              <w:bottom w:w="108" w:type="dxa"/>
-              <w:right w:w="168" w:type="dxa"/>
-            </w:tcMar>
-            <w:vAlign w:val="top"/>
-          </w:tcPr>
-          <w:p>
-            <w:pPr>
-              <w:jc w:val="left"/>
-              <w:rPr>
-                <w:color w:val="212121"/>
-              </w:rPr>
-            </w:pPr>
-            <w:r>
-              <w:rPr>
-                <w:rFonts w:hint="eastAsia" w:ascii="宋体" w:hAnsi="宋体" w:eastAsia="宋体" w:cs="宋体"/>
-                <w:color w:val="212121"/>
-                <w:sz w:val="21"/>
-              </w:rPr>
-              <w:t>防跟随牛（follower）检测</w:t>
+              <w:t>实际出口确认：牛已进入复核支路</w:t>
             </w:r>
           </w:p>
         </w:tc>
@@ -5047,7 +4769,7 @@
     </w:tbl>
     <w:p>
       <w:pPr>
-        <w:pStyle w:val="000002"/>
+        <w:pStyle w:val="00000b"/>
         <w:keepNext w:val="1"/>
         <w:keepLines w:val="1"/>
         <w:spacing w:before="528" w:beforeAutospacing="1" w:after="180" w:afterAutospacing="1" w:line="384"/>
@@ -5073,7 +4795,7 @@
     </w:p>
     <w:p>
       <w:pPr>
-        <w:pStyle w:val="x5b1eo"/>
+        <w:pStyle w:val="00000d"/>
         <w:rPr>
           <w:rFonts w:hint="eastAsia" w:ascii="宋体" w:hAnsi="宋体" w:eastAsia="宋体" w:cs="宋体"/>
           <w:color w:val="212121"/>
@@ -5091,7 +4813,7 @@
     </w:p>
     <w:tbl>
       <w:tblPr>
-        <w:tblStyle w:val="84mq3d"/>
+        <w:tblStyle w:val="000009"/>
         <w:tblLayout w:type="fixed"/>
       </w:tblPr>
       <w:tblGrid>
@@ -5125,14 +4847,14 @@
                 <w:b w:val="1"/>
                 <w:color w:val="212121"/>
               </w:rPr>
-              <w:t>侧向监测不纳入基线设计：</w:t>
-            </w:r>
-            <w:r>
-              <w:rPr>
-                <w:rFonts w:hint="eastAsia" w:ascii="宋体" w:hAnsi="宋体" w:eastAsia="宋体" w:cs="宋体"/>
-                <w:color w:val="212121"/>
-              </w:rPr>
-              <w:t>它针对的「两头并排」已由尺寸约束在物理上排除（1.20 m 超出 800 mm 上限），「两头首尾」由 U-B1／U-B2 的通行时长与轮廓负责；没有侧向监测时最坏情况是多一个例外（转人工核验），不会造成错误身份。本表 6 个超声点与整合稿 §10.2 的 Six planned ultrasonic points (U-A, U-IN, U-B1, U-B2, U-N, U-Q) 完全一致。若试验中因偏心导致的读失败超过约定比例，再评估加装单侧探头（一个即可判断贴哪侧墙）。</w:t>
+              <w:t>传感布局精简为四点：</w:t>
+            </w:r>
+            <w:r>
+              <w:rPr>
+                <w:rFonts w:hint="eastAsia" w:ascii="宋体" w:hAnsi="宋体" w:eastAsia="宋体" w:cs="宋体"/>
+                <w:color w:val="212121"/>
+              </w:rPr>
+              <w:t>B 段进出各一个（U-B1／U-B2），正常回转与复核支路各一个（U-N／U-E）。被裁撤三点的职责去向——U-N 的邻标签监测由「窗口内不同 EID 读数」判据承接；U-Q／U-IN 的防跟随由「G1 关闭期间 B 段物理隔离 + 分支传感确认清空后才放行下一头」承接；U-A 的占位检测由「有界窗口 + 安全层阻碍响应」承接，该环节不属身份关键链路，失败模式是多一个例外或损失数秒，不会造成错误身份。整合稿 §10.2 的六点枚举需同步改为四点（见第九章表 10）。</w:t>
             </w:r>
           </w:p>
         </w:tc>
@@ -5471,7 +5193,7 @@
                 <w:color w:val="212121"/>
                 <w:sz w:val="21"/>
               </w:rPr>
-              <w:t>U-A／U-IN 报 occupied；A 段作为队列缓冲</w:t>
+              <w:t>G0 开启有界窗口放入一头；A 为单牛容量，G0 关闭后由几何隔离（A 段不设传感，见表 3 注）</w:t>
             </w:r>
           </w:p>
         </w:tc>
@@ -5505,7 +5227,7 @@
                 <w:color w:val="212121"/>
                 <w:sz w:val="21"/>
               </w:rPr>
-              <w:t>同时进入多头 → 排队等待，不推进</w:t>
+              <w:t>窗口超时视为 A 空 → 开 G0 放入下一头</w:t>
             </w:r>
           </w:p>
         </w:tc>
@@ -5576,7 +5298,7 @@
                 <w:color w:val="212121"/>
                 <w:sz w:val="21"/>
               </w:rPr>
-              <w:t>尺寸约束 + U-A／U-IN 轮廓 + 无跟随检测，判定 A 内仅一头</w:t>
+              <w:t>G1 开启入场窗口 → U-B1 触发 → 关 G1；尺寸约束 + 门序判定 B 内仅一头</w:t>
             </w:r>
           </w:p>
         </w:tc>
@@ -5610,7 +5332,7 @@
                 <w:color w:val="212121"/>
                 <w:sz w:val="21"/>
               </w:rPr>
-              <w:t>uncertain → 该头转复核栏，后续牛继续</w:t>
+              <w:t>U-B1 未触发 → 窗口超时，关 G1 重试</w:t>
             </w:r>
           </w:p>
         </w:tc>
@@ -5786,7 +5508,7 @@
                 <w:color w:val="212121"/>
                 <w:sz w:val="21"/>
               </w:rPr>
-              <w:t>U-B1／U-B2 须在时间窗内报 occupied</w:t>
+              <w:t>U-B1 触发后关 G1</w:t>
             </w:r>
           </w:p>
         </w:tc>
@@ -5820,7 +5542,7 @@
                 <w:color w:val="212121"/>
                 <w:sz w:val="21"/>
               </w:rPr>
-              <w:t>未报 → 停止，检查探头</w:t>
+              <w:t>未触发 → 停止，检查探头</w:t>
             </w:r>
           </w:p>
         </w:tc>
@@ -5891,7 +5613,7 @@
                 <w:color w:val="212121"/>
                 <w:sz w:val="21"/>
               </w:rPr>
-              <w:t>G1、G2 均关闭；采集 B1／B2 轮廓 + 横向位置 + EID 读数</w:t>
+              <w:t>G1、G2 均关闭；U-B1／U-B2 至少一个在位（波束覆盖规则）确认占位；采集通行时长 + EID 读数</w:t>
             </w:r>
           </w:p>
         </w:tc>
@@ -6101,7 +5823,7 @@
                 <w:color w:val="212121"/>
                 <w:sz w:val="21"/>
               </w:rPr>
-              <w:t>通过 → 接受身份、D 定位、G2 开；U-Q／U-N + 门反馈确认实际出口</w:t>
+              <w:t>通过 → 接受身份、D 定位、G2 开；U-N／U-E 分支传感 + 门反馈确认实际出口</w:t>
             </w:r>
           </w:p>
         </w:tc>
@@ -6248,7 +5970,7 @@
     </w:tbl>
     <w:p>
       <w:pPr>
-        <w:pStyle w:val="000002"/>
+        <w:pStyle w:val="00000b"/>
         <w:keepNext w:val="1"/>
         <w:keepLines w:val="1"/>
         <w:spacing w:before="528" w:beforeAutospacing="1" w:after="180" w:afterAutospacing="1" w:line="384"/>
@@ -6292,7 +6014,7 @@
     </w:p>
     <w:p>
       <w:pPr>
-        <w:pStyle w:val="000006"/>
+        <w:pStyle w:val="00000c"/>
         <w:keepNext w:val="1"/>
         <w:keepLines w:val="1"/>
         <w:spacing w:before="288" w:beforeAutospacing="1" w:after="180" w:afterAutospacing="1" w:line="384"/>
@@ -6588,16 +6310,18 @@
             <w:pPr>
               <w:jc w:val="left"/>
               <w:rPr>
-                <w:color w:val="212121"/>
-              </w:rPr>
-            </w:pPr>
-            <w:r>
-              <w:rPr>
-                <w:rFonts w:hint="eastAsia" w:ascii="宋体" w:hAnsi="宋体" w:eastAsia="宋体" w:cs="宋体"/>
-                <w:color w:val="212121"/>
-                <w:sz w:val="21"/>
-              </w:rPr>
-              <w:t>轮廓峰宽</w:t>
+                <w:rFonts w:hint="eastAsia" w:ascii="宋体" w:hAnsi="宋体" w:eastAsia="宋体" w:cs="宋体"/>
+                <w:color w:val="212121"/>
+                <w:sz w:val="21"/>
+              </w:rPr>
+            </w:pPr>
+            <w:r>
+              <w:rPr>
+                <w:rFonts w:hint="eastAsia" w:ascii="宋体" w:hAnsi="宋体" w:eastAsia="宋体" w:cs="宋体"/>
+                <w:color w:val="212121"/>
+                <w:sz w:val="21"/>
+              </w:rPr>
+              <w:t>双点覆盖</w:t>
             </w:r>
           </w:p>
         </w:tc>
@@ -6622,16 +6346,18 @@
             <w:pPr>
               <w:jc w:val="left"/>
               <w:rPr>
-                <w:color w:val="212121"/>
-              </w:rPr>
-            </w:pPr>
-            <w:r>
-              <w:rPr>
-                <w:rFonts w:hint="eastAsia" w:ascii="宋体" w:hAnsi="宋体" w:eastAsia="宋体" w:cs="宋体"/>
-                <w:color w:val="212121"/>
-                <w:sz w:val="21"/>
-              </w:rPr>
-              <w:t>≤ 0.75 m（单牛胸宽 0.60 m + 运动余量）</w:t>
+                <w:rFonts w:hint="eastAsia" w:ascii="宋体" w:hAnsi="宋体" w:eastAsia="宋体" w:cs="宋体"/>
+                <w:color w:val="212121"/>
+                <w:sz w:val="21"/>
+              </w:rPr>
+            </w:pPr>
+            <w:r>
+              <w:rPr>
+                <w:rFonts w:hint="eastAsia" w:ascii="宋体" w:hAnsi="宋体" w:eastAsia="宋体" w:cs="宋体"/>
+                <w:color w:val="212121"/>
+                <w:sz w:val="21"/>
+              </w:rPr>
+              <w:t>U-B1、U-B2 至少一个在位；两端波束带之间无覆盖段 0.9 m 短于最短体长 1.45 m，牛无法藏在两波束之间</w:t>
             </w:r>
           </w:p>
         </w:tc>
@@ -6656,16 +6382,18 @@
             <w:pPr>
               <w:jc w:val="left"/>
               <w:rPr>
-                <w:color w:val="212121"/>
-              </w:rPr>
-            </w:pPr>
-            <w:r>
-              <w:rPr>
-                <w:rFonts w:hint="eastAsia" w:ascii="宋体" w:hAnsi="宋体" w:eastAsia="宋体" w:cs="宋体"/>
-                <w:color w:val="212121"/>
-                <w:sz w:val="21"/>
-              </w:rPr>
-              <w:t>超宽 → 疑两头并排</w:t>
+                <w:rFonts w:hint="eastAsia" w:ascii="宋体" w:hAnsi="宋体" w:eastAsia="宋体" w:cs="宋体"/>
+                <w:color w:val="212121"/>
+                <w:sz w:val="21"/>
+              </w:rPr>
+            </w:pPr>
+            <w:r>
+              <w:rPr>
+                <w:rFonts w:hint="eastAsia" w:ascii="宋体" w:hAnsi="宋体" w:eastAsia="宋体" w:cs="宋体"/>
+                <w:color w:val="212121"/>
+                <w:sz w:val="21"/>
+              </w:rPr>
+              <w:t>扫描窗口内两点均空 → uncertain，转人工</w:t>
             </w:r>
           </w:p>
         </w:tc>
@@ -6736,7 +6464,7 @@
                 <w:color w:val="212121"/>
                 <w:sz w:val="21"/>
               </w:rPr>
-              <w:t>4–12 s（对应 §10.7 约 24 s/头中 B 段耗时）</w:t>
+              <w:t>4–12 s（U-B1 触发至 U-B2 触发）</w:t>
             </w:r>
           </w:p>
         </w:tc>
@@ -7051,7 +6779,7 @@
                 <w:color w:val="212121"/>
                 <w:sz w:val="21"/>
               </w:rPr>
-              <w:t>U-Q／U-N 与门反馈一致</w:t>
+              <w:t>U-N／U-E 与门反馈一致</w:t>
             </w:r>
           </w:p>
         </w:tc>
@@ -7093,7 +6821,7 @@
     </w:tbl>
     <w:p>
       <w:pPr>
-        <w:pStyle w:val="000006"/>
+        <w:pStyle w:val="00000c"/>
         <w:keepNext w:val="1"/>
         <w:keepLines w:val="1"/>
         <w:spacing w:before="288" w:beforeAutospacing="1" w:after="180" w:afterAutospacing="1" w:line="384"/>
@@ -8049,7 +7777,7 @@
     </w:p>
     <w:p>
       <w:pPr>
-        <w:pStyle w:val="000002"/>
+        <w:pStyle w:val="00000b"/>
         <w:keepNext w:val="1"/>
         <w:keepLines w:val="1"/>
         <w:spacing w:before="528" w:beforeAutospacing="1" w:after="180" w:afterAutospacing="1" w:line="384"/>
@@ -8775,7 +8503,7 @@
     </w:tbl>
     <w:p>
       <w:pPr>
-        <w:pStyle w:val="000002"/>
+        <w:pStyle w:val="00000b"/>
         <w:keepNext w:val="1"/>
         <w:keepLines w:val="1"/>
         <w:spacing w:before="528" w:beforeAutospacing="1" w:after="180" w:afterAutospacing="1" w:line="384"/>
@@ -9855,7 +9583,7 @@
     </w:p>
     <w:p>
       <w:pPr>
-        <w:pStyle w:val="000002"/>
+        <w:pStyle w:val="00000b"/>
         <w:keepNext w:val="1"/>
         <w:keepLines w:val="1"/>
         <w:spacing w:before="528" w:beforeAutospacing="1" w:after="180" w:afterAutospacing="1" w:line="384"/>
@@ -10918,7 +10646,7 @@
     </w:tbl>
     <w:p>
       <w:pPr>
-        <w:pStyle w:val="000002"/>
+        <w:pStyle w:val="00000b"/>
         <w:keepNext w:val="1"/>
         <w:keepLines w:val="1"/>
         <w:spacing w:before="528" w:beforeAutospacing="1" w:after="180" w:afterAutospacing="1" w:line="384"/>
@@ -11414,7 +11142,7 @@
                 <w:color w:val="212121"/>
                 <w:sz w:val="21"/>
               </w:rPr>
-              <w:t>改为前置条件清单（对应第六章 P1–P4），并注明由本方案满足</w:t>
+              <w:t>六点枚举改为四点（U-B1／U-B2／U-N／U-E，位置与职责见表 3），并补边界句（见下方建议补句）</w:t>
             </w:r>
           </w:p>
         </w:tc>
@@ -11519,7 +11247,7 @@
                 <w:color w:val="212121"/>
                 <w:sz w:val="21"/>
               </w:rPr>
-              <w:t>末尾补边界句（见下方建议补句）</w:t>
+              <w:t>「Six points are provisional」仍成立；数量与标签随 P14 同步改为四点</w:t>
             </w:r>
           </w:p>
         </w:tc>
@@ -12109,15 +11837,7 @@
                 <w:color w:val="212121"/>
                 <w:sz w:val="24"/>
               </w:rPr>
-              <w:t>§10.2 P14 建议补句：</w:t>
-            </w:r>
-            <w:r>
-              <w:rPr>
-                <w:rFonts w:ascii="宋体" w:hAnsi="宋体" w:eastAsia="宋体" w:cs="宋体"/>
-                <w:color w:val="212121"/>
-                <w:sz w:val="24"/>
-              </w:rPr>
-              <w:t>These points corroborate occupancy and passage; they cannot by themselves count animals, so single-cow acceptance is decided by the machine from section dimensions, closed-gate interlocks and profile matching, with unresolved cases routed to manual review.</w:t>
+              <w:t>§10.2 P14 建议补句：These points corroborate occupancy and passage; they cannot by themselves count animals, so single-cow acceptance is decided by the machine from section dimensions, closed-gate interlocks, two-beam coverage at the section ends and passage timing, with unresolved cases routed to manual review.</w:t>
             </w:r>
           </w:p>
         </w:tc>
@@ -12125,7 +11845,7 @@
     </w:tbl>
     <w:p>
       <w:pPr>
-        <w:pStyle w:val="000002"/>
+        <w:pStyle w:val="00000b"/>
         <w:keepNext w:val="1"/>
         <w:keepLines w:val="1"/>
         <w:spacing w:before="528" w:beforeAutospacing="1" w:after="180" w:afterAutospacing="1" w:line="384"/>
@@ -12344,7 +12064,7 @@
           <w:color w:val="212121"/>
           <w:sz w:val="24"/>
         </w:rPr>
-        <w:t>顶牛、急退可能让两头牛同时部分占段；由「无跟随」检测与计数对账承接，但须试验验证，不能假定不存在。</w:t>
+        <w:t>顶牛、急退可能让两头牛同时部分占段；由门序（扫描期间 G1 关闭、B 段物理隔离）与计数对账承接，但须试验验证，不能假定不存在。</w:t>
       </w:r>
     </w:p>
     <w:p>
@@ -12656,6 +12376,17 @@
   <w:abstractNum w:abstractNumId="0">
     <w:lvl w:ilvl="0">
       <w:start w:val="1"/>
+      <w:numFmt w:val="decimal"/>
+      <w:lvlText w:val="%1."/>
+      <w:lvlJc w:val="left"/>
+      <w:pPr>
+        <w:ind w:left="420" w:hanging="420"/>
+      </w:pPr>
+    </w:lvl>
+  </w:abstractNum>
+  <w:abstractNum w:abstractNumId="1">
+    <w:lvl w:ilvl="0">
+      <w:start w:val="1"/>
       <w:numFmt w:val="bullet"/>
       <w:lvlText w:val=""/>
       <w:lvlJc w:val="left"/>
@@ -12667,22 +12398,11 @@
       </w:rPr>
     </w:lvl>
   </w:abstractNum>
-  <w:abstractNum w:abstractNumId="1">
-    <w:lvl w:ilvl="0">
-      <w:start w:val="1"/>
-      <w:numFmt w:val="decimal"/>
-      <w:lvlText w:val="%1."/>
-      <w:lvlJc w:val="left"/>
-      <w:pPr>
-        <w:ind w:left="420" w:hanging="420"/>
-      </w:pPr>
-    </w:lvl>
-  </w:abstractNum>
   <w:num w:numId="2">
-    <w:abstractNumId w:val="1"/>
+    <w:abstractNumId w:val="0"/>
   </w:num>
   <w:num w:numId="1">
-    <w:abstractNumId w:val="0"/>
+    <w:abstractNumId w:val="1"/>
   </w:num>
 </w:numbering>
 </file>
@@ -12706,115 +12426,98 @@
     </w:pPrDefault>
   </w:docDefaults>
   <w:latentStyles w:defLockedState="0" w:defUIPriority="99" w:defSemiHidden="0" w:defUnhideWhenUsed="0" w:defQFormat="0" w:count="88">
+    <w:lsdException w:name="List" w:semiHidden="1" w:unhideWhenUsed="1"/>
+    <w:lsdException w:name="footnote text" w:semiHidden="1" w:unhideWhenUsed="1"/>
+    <w:lsdException w:name="List Bullet 2" w:semiHidden="1" w:unhideWhenUsed="1"/>
+    <w:lsdException w:name="table of authorities" w:semiHidden="1" w:unhideWhenUsed="1"/>
+    <w:lsdException w:name="index 5" w:semiHidden="1" w:unhideWhenUsed="1"/>
+    <w:lsdException w:name="footnote reference" w:semiHidden="1" w:unhideWhenUsed="1"/>
+    <w:lsdException w:name="heading 6" w:uiPriority="9" w:semiHidden="1" w:unhideWhenUsed="1" w:qFormat="1"/>
+    <w:lsdException w:name="line number" w:semiHidden="1" w:unhideWhenUsed="1"/>
+    <w:lsdException w:name="heading 4" w:uiPriority="9" w:semiHidden="1" w:unhideWhenUsed="1" w:qFormat="1"/>
+    <w:lsdException w:name="toc 8" w:uiPriority="39" w:semiHidden="1" w:unhideWhenUsed="1"/>
+    <w:lsdException w:name="caption" w:uiPriority="35" w:semiHidden="1" w:unhideWhenUsed="1" w:qFormat="1"/>
+    <w:lsdException w:name="Body Text Indent 3" w:semiHidden="1" w:unhideWhenUsed="1"/>
+    <w:lsdException w:name="index 9" w:semiHidden="1" w:unhideWhenUsed="1"/>
+    <w:lsdException w:name="index 1" w:semiHidden="1" w:unhideWhenUsed="1"/>
+    <w:lsdException w:name="toc 5" w:uiPriority="39" w:semiHidden="1" w:unhideWhenUsed="1"/>
+    <w:lsdException w:name="Normal" w:uiPriority="0" w:qFormat="1"/>
+    <w:lsdException w:name="index 2" w:semiHidden="1" w:unhideWhenUsed="1"/>
+    <w:lsdException w:name="List Number 4" w:semiHidden="1" w:unhideWhenUsed="1"/>
     <w:lsdException w:name="List Number" w:semiHidden="1" w:unhideWhenUsed="1"/>
-    <w:lsdException w:name="toc 2" w:uiPriority="39" w:semiHidden="1" w:unhideWhenUsed="1"/>
+    <w:lsdException w:name="header" w:semiHidden="1" w:unhideWhenUsed="1"/>
+    <w:lsdException w:name="page number" w:semiHidden="1" w:unhideWhenUsed="1"/>
+    <w:lsdException w:name="toc 4" w:uiPriority="39" w:semiHidden="1" w:unhideWhenUsed="1"/>
+    <w:lsdException w:name="Title" w:uiPriority="10" w:qFormat="1"/>
+    <w:lsdException w:name="List 2" w:semiHidden="1" w:unhideWhenUsed="1"/>
+    <w:lsdException w:name="Body Text First Indent" w:semiHidden="1" w:unhideWhenUsed="1"/>
+    <w:lsdException w:name="List 5" w:semiHidden="1" w:unhideWhenUsed="1"/>
+    <w:lsdException w:name="footer" w:semiHidden="1" w:unhideWhenUsed="1"/>
+    <w:lsdException w:name="index 3" w:semiHidden="1" w:unhideWhenUsed="1"/>
+    <w:lsdException w:name="List Continue 2" w:semiHidden="1" w:unhideWhenUsed="1"/>
+    <w:lsdException w:name="annotation reference" w:semiHidden="1" w:unhideWhenUsed="1"/>
+    <w:lsdException w:name="Strong" w:uiPriority="22" w:qFormat="1"/>
+    <w:lsdException w:name="Hyperlink" w:semiHidden="1" w:unhideWhenUsed="1"/>
+    <w:lsdException w:name="toc 3" w:uiPriority="39" w:semiHidden="1" w:unhideWhenUsed="1"/>
+    <w:lsdException w:name="Body Text Indent" w:semiHidden="1" w:unhideWhenUsed="1"/>
+    <w:lsdException w:name="List Number 5" w:semiHidden="1" w:unhideWhenUsed="1"/>
+    <w:lsdException w:name="toc 7" w:uiPriority="39" w:semiHidden="1" w:unhideWhenUsed="1"/>
+    <w:lsdException w:name="Body Text 2" w:semiHidden="1" w:unhideWhenUsed="1"/>
+    <w:lsdException w:name="FollowedHyperlink" w:semiHidden="1" w:unhideWhenUsed="1"/>
+    <w:lsdException w:name="index 6" w:semiHidden="1" w:unhideWhenUsed="1"/>
+    <w:lsdException w:name="heading 3" w:uiPriority="9" w:semiHidden="1" w:unhideWhenUsed="1" w:qFormat="1"/>
+    <w:lsdException w:name="heading 9" w:uiPriority="9" w:semiHidden="1" w:unhideWhenUsed="1" w:qFormat="1"/>
+    <w:lsdException w:name="Body Text Indent 2" w:semiHidden="1" w:unhideWhenUsed="1"/>
+    <w:lsdException w:name="endnote text" w:semiHidden="1" w:unhideWhenUsed="1"/>
+    <w:lsdException w:name="List Continue 4" w:semiHidden="1" w:unhideWhenUsed="1"/>
+    <w:lsdException w:name="Closing" w:semiHidden="1" w:unhideWhenUsed="1"/>
+    <w:lsdException w:name="index 8" w:semiHidden="1" w:unhideWhenUsed="1"/>
+    <w:lsdException w:name="index 7" w:semiHidden="1" w:unhideWhenUsed="1"/>
+    <w:lsdException w:name="List Bullet 4" w:semiHidden="1" w:unhideWhenUsed="1"/>
+    <w:lsdException w:name="index heading" w:semiHidden="1" w:unhideWhenUsed="1"/>
+    <w:lsdException w:name="Body Text" w:semiHidden="1" w:unhideWhenUsed="1"/>
+    <w:lsdException w:name="heading 7" w:uiPriority="9" w:semiHidden="1" w:unhideWhenUsed="1" w:qFormat="1"/>
+    <w:lsdException w:name="List Bullet" w:semiHidden="1" w:unhideWhenUsed="1"/>
+    <w:lsdException w:name="Message Header" w:semiHidden="1" w:unhideWhenUsed="1"/>
+    <w:lsdException w:name="List Bullet 3" w:semiHidden="1" w:unhideWhenUsed="1"/>
+    <w:lsdException w:name="Default Paragraph Font" w:uiPriority="1" w:semiHidden="1" w:unhideWhenUsed="1"/>
+    <w:lsdException w:name="Body Text 3" w:semiHidden="1" w:unhideWhenUsed="1"/>
+    <w:lsdException w:name="List Bullet 5" w:semiHidden="1" w:unhideWhenUsed="1"/>
+    <w:lsdException w:name="toc 6" w:uiPriority="39" w:semiHidden="1" w:unhideWhenUsed="1"/>
     <w:lsdException w:name="heading 5" w:uiPriority="9" w:semiHidden="1" w:unhideWhenUsed="1" w:qFormat="1"/>
     <w:lsdException w:name="toc 1" w:uiPriority="39" w:semiHidden="1" w:unhideWhenUsed="1"/>
-    <w:lsdException w:name="List Bullet 4" w:semiHidden="1" w:unhideWhenUsed="1"/>
-    <w:lsdException w:name="heading 4" w:uiPriority="9" w:semiHidden="1" w:unhideWhenUsed="1" w:qFormat="1"/>
+    <w:lsdException w:name="toc 2" w:uiPriority="39" w:semiHidden="1" w:unhideWhenUsed="1"/>
+    <w:lsdException w:name="List Continue" w:semiHidden="1" w:unhideWhenUsed="1"/>
+    <w:lsdException w:name="List Number 3" w:semiHidden="1" w:unhideWhenUsed="1"/>
+    <w:lsdException w:name="annotation text" w:semiHidden="1" w:unhideWhenUsed="1"/>
+    <w:lsdException w:name="heading 8" w:uiPriority="9" w:semiHidden="1" w:unhideWhenUsed="1" w:qFormat="1"/>
+    <w:lsdException w:name="Salutation" w:semiHidden="1" w:unhideWhenUsed="1"/>
+    <w:lsdException w:name="Signature" w:semiHidden="1" w:unhideWhenUsed="1"/>
     <w:lsdException w:name="Subtitle" w:uiPriority="11" w:qFormat="1"/>
-    <w:lsdException w:name="index 8" w:semiHidden="1" w:unhideWhenUsed="1"/>
-    <w:lsdException w:name="Body Text Indent" w:semiHidden="1" w:unhideWhenUsed="1"/>
-    <w:lsdException w:name="line number" w:semiHidden="1" w:unhideWhenUsed="1"/>
-    <w:lsdException w:name="List 2" w:semiHidden="1" w:unhideWhenUsed="1"/>
-    <w:lsdException w:name="Body Text 3" w:semiHidden="1" w:unhideWhenUsed="1"/>
-    <w:lsdException w:name="Body Text" w:semiHidden="1" w:unhideWhenUsed="1"/>
+    <w:lsdException w:name="Body Text First Indent 2" w:semiHidden="1" w:unhideWhenUsed="1"/>
+    <w:lsdException w:name="toa heading" w:semiHidden="1" w:unhideWhenUsed="1"/>
+    <w:lsdException w:name="endnote reference" w:semiHidden="1" w:unhideWhenUsed="1"/>
+    <w:lsdException w:name="Date" w:semiHidden="1" w:unhideWhenUsed="1"/>
+    <w:lsdException w:name="Block Text" w:semiHidden="1" w:unhideWhenUsed="1"/>
     <w:lsdException w:name="table of figures" w:semiHidden="1" w:unhideWhenUsed="1"/>
-    <w:lsdException w:name="index heading" w:semiHidden="1" w:unhideWhenUsed="1"/>
-    <w:lsdException w:name="index 9" w:semiHidden="1" w:unhideWhenUsed="1"/>
+    <w:lsdException w:name="List Continue 5" w:semiHidden="1" w:unhideWhenUsed="1"/>
+    <w:lsdException w:name="heading 2" w:uiPriority="9" w:semiHidden="1" w:unhideWhenUsed="1" w:qFormat="1"/>
+    <w:lsdException w:name="List Continue 3" w:semiHidden="1" w:unhideWhenUsed="1"/>
+    <w:lsdException w:name="heading 1" w:uiPriority="9" w:qFormat="1"/>
+    <w:lsdException w:name="macro" w:semiHidden="1" w:unhideWhenUsed="1"/>
+    <w:lsdException w:name="List 3" w:semiHidden="1" w:unhideWhenUsed="1"/>
+    <w:lsdException w:name="Note Heading" w:semiHidden="1" w:unhideWhenUsed="1"/>
     <w:lsdException w:name="envelope address" w:semiHidden="1" w:unhideWhenUsed="1"/>
-    <w:lsdException w:name="Body Text First Indent" w:semiHidden="1" w:unhideWhenUsed="1"/>
-    <w:lsdException w:name="List Continue" w:semiHidden="1" w:unhideWhenUsed="1"/>
-    <w:lsdException w:name="Block Text" w:semiHidden="1" w:unhideWhenUsed="1"/>
-    <w:lsdException w:name="Message Header" w:semiHidden="1" w:unhideWhenUsed="1"/>
-    <w:lsdException w:name="index 3" w:semiHidden="1" w:unhideWhenUsed="1"/>
-    <w:lsdException w:name="List Continue 3" w:semiHidden="1" w:unhideWhenUsed="1"/>
-    <w:lsdException w:name="toc 6" w:uiPriority="39" w:semiHidden="1" w:unhideWhenUsed="1"/>
-    <w:lsdException w:name="Note Heading" w:semiHidden="1" w:unhideWhenUsed="1"/>
-    <w:lsdException w:name="heading 7" w:uiPriority="9" w:semiHidden="1" w:unhideWhenUsed="1" w:qFormat="1"/>
-    <w:lsdException w:name="Body Text 2" w:semiHidden="1" w:unhideWhenUsed="1"/>
-    <w:lsdException w:name="Normal" w:uiPriority="0" w:qFormat="1"/>
-    <w:lsdException w:name="toc 8" w:uiPriority="39" w:semiHidden="1" w:unhideWhenUsed="1"/>
-    <w:lsdException w:name="toc 7" w:uiPriority="39" w:semiHidden="1" w:unhideWhenUsed="1"/>
-    <w:lsdException w:name="Body Text Indent 2" w:semiHidden="1" w:unhideWhenUsed="1"/>
     <w:lsdException w:name="index 4" w:semiHidden="1" w:unhideWhenUsed="1"/>
-    <w:lsdException w:name="heading 9" w:uiPriority="9" w:semiHidden="1" w:unhideWhenUsed="1" w:qFormat="1"/>
-    <w:lsdException w:name="toa heading" w:semiHidden="1" w:unhideWhenUsed="1"/>
-    <w:lsdException w:name="heading 2" w:uiPriority="9" w:semiHidden="1" w:unhideWhenUsed="1" w:qFormat="1"/>
-    <w:lsdException w:name="footer" w:semiHidden="1" w:unhideWhenUsed="1"/>
-    <w:lsdException w:name="toc 4" w:uiPriority="39" w:semiHidden="1" w:unhideWhenUsed="1"/>
-    <w:lsdException w:name="List Continue 5" w:semiHidden="1" w:unhideWhenUsed="1"/>
-    <w:lsdException w:name="heading 6" w:uiPriority="9" w:semiHidden="1" w:unhideWhenUsed="1" w:qFormat="1"/>
-    <w:lsdException w:name="heading 1" w:uiPriority="9" w:qFormat="1"/>
-    <w:lsdException w:name="caption" w:uiPriority="35" w:semiHidden="1" w:unhideWhenUsed="1" w:qFormat="1"/>
-    <w:lsdException w:name="Body Text Indent 3" w:semiHidden="1" w:unhideWhenUsed="1"/>
+    <w:lsdException w:name="Normal Indent" w:semiHidden="1" w:unhideWhenUsed="1"/>
+    <w:lsdException w:name="List 4" w:semiHidden="1" w:unhideWhenUsed="1"/>
+    <w:lsdException w:name="List Number 2" w:semiHidden="1" w:unhideWhenUsed="1"/>
+    <w:lsdException w:name="toc 9" w:uiPriority="39" w:semiHidden="1" w:unhideWhenUsed="1"/>
     <w:lsdException w:name="envelope return" w:semiHidden="1" w:unhideWhenUsed="1"/>
-    <w:lsdException w:name="index 5" w:semiHidden="1" w:unhideWhenUsed="1"/>
-    <w:lsdException w:name="Closing" w:semiHidden="1" w:unhideWhenUsed="1"/>
-    <w:lsdException w:name="List Number 2" w:semiHidden="1" w:unhideWhenUsed="1"/>
-    <w:lsdException w:name="heading 3" w:uiPriority="9" w:semiHidden="1" w:unhideWhenUsed="1" w:qFormat="1"/>
-    <w:lsdException w:name="index 1" w:semiHidden="1" w:unhideWhenUsed="1"/>
-    <w:lsdException w:name="Signature" w:semiHidden="1" w:unhideWhenUsed="1"/>
-    <w:lsdException w:name="Normal Indent" w:semiHidden="1" w:unhideWhenUsed="1"/>
-    <w:lsdException w:name="annotation text" w:semiHidden="1" w:unhideWhenUsed="1"/>
-    <w:lsdException w:name="toc 9" w:uiPriority="39" w:semiHidden="1" w:unhideWhenUsed="1"/>
-    <w:lsdException w:name="List Continue 2" w:semiHidden="1" w:unhideWhenUsed="1"/>
-    <w:lsdException w:name="List Number 3" w:semiHidden="1" w:unhideWhenUsed="1"/>
-    <w:lsdException w:name="annotation reference" w:semiHidden="1" w:unhideWhenUsed="1"/>
-    <w:lsdException w:name="table of authorities" w:semiHidden="1" w:unhideWhenUsed="1"/>
-    <w:lsdException w:name="Salutation" w:semiHidden="1" w:unhideWhenUsed="1"/>
-    <w:lsdException w:name="macro" w:semiHidden="1" w:unhideWhenUsed="1"/>
-    <w:lsdException w:name="List Number 5" w:semiHidden="1" w:unhideWhenUsed="1"/>
-    <w:lsdException w:name="List 4" w:semiHidden="1" w:unhideWhenUsed="1"/>
-    <w:lsdException w:name="List Bullet 3" w:semiHidden="1" w:unhideWhenUsed="1"/>
-    <w:lsdException w:name="Date" w:semiHidden="1" w:unhideWhenUsed="1"/>
-    <w:lsdException w:name="Body Text First Indent 2" w:semiHidden="1" w:unhideWhenUsed="1"/>
-    <w:lsdException w:name="Strong" w:uiPriority="22" w:qFormat="1"/>
-    <w:lsdException w:name="footnote reference" w:semiHidden="1" w:unhideWhenUsed="1"/>
-    <w:lsdException w:name="Hyperlink" w:semiHidden="1" w:unhideWhenUsed="1"/>
-    <w:lsdException w:name="List Continue 4" w:semiHidden="1" w:unhideWhenUsed="1"/>
-    <w:lsdException w:name="List Bullet 5" w:semiHidden="1" w:unhideWhenUsed="1"/>
-    <w:lsdException w:name="index 6" w:semiHidden="1" w:unhideWhenUsed="1"/>
-    <w:lsdException w:name="List 5" w:semiHidden="1" w:unhideWhenUsed="1"/>
-    <w:lsdException w:name="List" w:semiHidden="1" w:unhideWhenUsed="1"/>
-    <w:lsdException w:name="FollowedHyperlink" w:semiHidden="1" w:unhideWhenUsed="1"/>
-    <w:lsdException w:name="header" w:semiHidden="1" w:unhideWhenUsed="1"/>
-    <w:lsdException w:name="Default Paragraph Font" w:uiPriority="1" w:semiHidden="1" w:unhideWhenUsed="1"/>
-    <w:lsdException w:name="index 2" w:semiHidden="1" w:unhideWhenUsed="1"/>
-    <w:lsdException w:name="endnote reference" w:semiHidden="1" w:unhideWhenUsed="1"/>
-    <w:lsdException w:name="heading 8" w:uiPriority="9" w:semiHidden="1" w:unhideWhenUsed="1" w:qFormat="1"/>
-    <w:lsdException w:name="List Bullet 2" w:semiHidden="1" w:unhideWhenUsed="1"/>
-    <w:lsdException w:name="page number" w:semiHidden="1" w:unhideWhenUsed="1"/>
-    <w:lsdException w:name="footnote text" w:semiHidden="1" w:unhideWhenUsed="1"/>
-    <w:lsdException w:name="toc 5" w:uiPriority="39" w:semiHidden="1" w:unhideWhenUsed="1"/>
-    <w:lsdException w:name="index 7" w:semiHidden="1" w:unhideWhenUsed="1"/>
-    <w:lsdException w:name="List Bullet" w:semiHidden="1" w:unhideWhenUsed="1"/>
-    <w:lsdException w:name="Title" w:uiPriority="10" w:qFormat="1"/>
-    <w:lsdException w:name="List 3" w:semiHidden="1" w:unhideWhenUsed="1"/>
-    <w:lsdException w:name="toc 3" w:uiPriority="39" w:semiHidden="1" w:unhideWhenUsed="1"/>
-    <w:lsdException w:name="endnote text" w:semiHidden="1" w:unhideWhenUsed="1"/>
-    <w:lsdException w:name="List Number 4" w:semiHidden="1" w:unhideWhenUsed="1"/>
   </w:latentStyles>
-  <w:style w:type="paragraph" w:styleId="000005">
-    <w:name w:val="toc 2"/>
-    <w:basedOn w:val="000003"/>
-    <w:qFormat w:val="1"/>
-    <w:pPr>
-      <w:tabs>
-        <w:tab w:val="right" w:leader="dot" w:pos="9072"/>
-      </w:tabs>
-      <w:spacing w:after="60" w:line="360"/>
-      <w:ind w:left="420"/>
-    </w:pPr>
-    <w:rPr>
-      <w:rFonts w:ascii="SimSun" w:hAnsi="SimSun" w:eastAsia="SimSun" w:cs="SimSun"/>
-      <w:sz w:val="24"/>
-      <w:szCs w:val="24"/>
-    </w:rPr>
-  </w:style>
-  <w:style w:type="paragraph" w:styleId="000004">
+  <w:style w:type="paragraph" w:styleId="000008">
     <w:name w:val="toc 1"/>
-    <w:basedOn w:val="000003"/>
+    <w:basedOn w:val="000007"/>
     <w:qFormat w:val="1"/>
     <w:pPr>
       <w:tabs>
@@ -12828,25 +12531,10 @@
       <w:szCs w:val="24"/>
     </w:rPr>
   </w:style>
-  <w:style w:type="table" w:styleId="84mq3d">
-    <w:name w:val="Table Grid"/>
-    <w:basedOn w:val="aelxla"/>
-    <w:uiPriority w:val="39"/>
-    <w:tblPr>
-      <w:tblBorders>
-        <w:top w:val="single" w:color="CBCDD1" w:sz="6" w:space="0"/>
-        <w:left w:val="single" w:color="CBCDD1" w:sz="6" w:space="0"/>
-        <w:bottom w:val="single" w:color="CBCDD1" w:sz="6" w:space="0"/>
-        <w:right w:val="single" w:color="CBCDD1" w:sz="6" w:space="0"/>
-        <w:insideH w:val="single" w:color="CBCDD1" w:sz="6" w:space="0"/>
-        <w:insideV w:val="single" w:color="CBCDD1" w:sz="6" w:space="0"/>
-      </w:tblBorders>
-    </w:tblPr>
-  </w:style>
-  <w:style w:type="paragraph" w:styleId="000002">
+  <w:style w:type="paragraph" w:styleId="00000b">
     <w:name w:val="heading 2"/>
-    <w:basedOn w:val="000003"/>
-    <w:next w:val="000003"/>
+    <w:basedOn w:val="000007"/>
+    <w:next w:val="000007"/>
     <w:uiPriority w:val="9"/>
     <w:qFormat w:val="1"/>
     <w:pPr>
@@ -12861,10 +12549,10 @@
       <w:szCs w:val="26"/>
     </w:rPr>
   </w:style>
-  <w:style w:type="paragraph" w:styleId="000006">
+  <w:style w:type="paragraph" w:styleId="00000c">
     <w:name w:val="heading 3"/>
-    <w:basedOn w:val="000003"/>
-    <w:next w:val="000003"/>
+    <w:basedOn w:val="000007"/>
+    <w:next w:val="000007"/>
     <w:uiPriority w:val="9"/>
     <w:qFormat w:val="1"/>
     <w:pPr>
@@ -12879,7 +12567,7 @@
       <w:szCs w:val="24"/>
     </w:rPr>
   </w:style>
-  <w:style w:type="table" w:styleId="aelxla" w:default="1">
+  <w:style w:type="table" w:styleId="00000a" w:default="1">
     <w:name w:val="Normal Table"/>
     <w:uiPriority w:val="99"/>
     <w:semiHidden w:val="1"/>
@@ -12897,7 +12585,7 @@
       <w:vAlign w:val="center"/>
     </w:tcPr>
   </w:style>
-  <w:style w:type="paragraph" w:styleId="x5b1eo" w:default="1">
+  <w:style w:type="paragraph" w:styleId="00000d" w:default="1">
     <w:name w:val="Normal"/>
     <w:pPr>
       <w:widowControl w:val="0"/>
@@ -12906,6 +12594,38 @@
     <w:rPr>
       <w:rFonts/>
     </w:rPr>
+  </w:style>
+  <w:style w:type="paragraph" w:styleId="000006">
+    <w:name w:val="toc 2"/>
+    <w:basedOn w:val="000007"/>
+    <w:qFormat w:val="1"/>
+    <w:pPr>
+      <w:tabs>
+        <w:tab w:val="right" w:leader="dot" w:pos="9072"/>
+      </w:tabs>
+      <w:spacing w:after="60" w:line="360"/>
+      <w:ind w:left="420"/>
+    </w:pPr>
+    <w:rPr>
+      <w:rFonts w:ascii="SimSun" w:hAnsi="SimSun" w:eastAsia="SimSun" w:cs="SimSun"/>
+      <w:sz w:val="24"/>
+      <w:szCs w:val="24"/>
+    </w:rPr>
+  </w:style>
+  <w:style w:type="table" w:styleId="000009">
+    <w:name w:val="Table Grid"/>
+    <w:basedOn w:val="00000a"/>
+    <w:uiPriority w:val="39"/>
+    <w:tblPr>
+      <w:tblBorders>
+        <w:top w:val="single" w:color="CBCDD1" w:sz="6" w:space="0"/>
+        <w:left w:val="single" w:color="CBCDD1" w:sz="6" w:space="0"/>
+        <w:bottom w:val="single" w:color="CBCDD1" w:sz="6" w:space="0"/>
+        <w:right w:val="single" w:color="CBCDD1" w:sz="6" w:space="0"/>
+        <w:insideH w:val="single" w:color="CBCDD1" w:sz="6" w:space="0"/>
+        <w:insideV w:val="single" w:color="CBCDD1" w:sz="6" w:space="0"/>
+      </w:tblBorders>
+    </w:tblPr>
   </w:style>
 </w:styles>
 </file>

</xml_diff>